<commit_message>
Artigo: embed dos screenshots + corrige typo no nome do fig6
- Renomeia fig6_lobby_topdowm.png -> fig6_lobby_topdown.png (typo, casa com
  FIG_IMAGES do md_to_docx).
- Move fig3_crosshair.png -> fig3_crosshair_OLD_bug.png. A captura original
  ficou com crosshair preto (bug do PNG, ja corrigido). Fig 3 fica como
  placeholder no .docx ate recapturar com o PNG novo.
- Regenera Artigo_SBC_VR_Folklore.docx e .pdf. Agora estao embedados 6/7
  figuras (1 Lobby, 2 arquitetura, 4 maquina-estados, 5 hierarchy, 6 top-down,
  7 NPCs). Falta so fig3 (recaptura pos-fix do crosshair).

Co-Authored-By: Claude Opus 4.7 (1M context) <noreply@anthropic.com>
</commit_message>
<xml_diff>
--- a/Project_essay/Artigo_SBC_VR_Folklore.docx
+++ b/Project_essay/Artigo_SBC_VR_Folklore.docx
@@ -209,729 +209,12 @@
     </w:p>
     <w:p>
       <w:pPr>
-        <w:spacing w:before="160"/>
         <w:jc w:val="center"/>
       </w:pPr>
       <w:r>
-        <w:rPr>
-          <w:i/>
-          <w:color w:val="808080"/>
-        </w:rPr>
-        <w:t>[  Figura 1: salve o screenshot como  figuras\fig1_lobby.png  e rode md_to_docx.py novamente  ]</w:t>
-      </w:r>
-    </w:p>
-    <w:p>
-      <w:pPr>
-        <w:spacing w:before="80" w:after="200"/>
-        <w:jc w:val="center"/>
-      </w:pPr>
-      <w:r>
-        <w:rPr>
-          <w:b/>
-          <w:sz w:val="20"/>
-        </w:rPr>
-        <w:t xml:space="preserve">Figura 1. </w:t>
-      </w:r>
-      <w:r>
-        <w:rPr>
-          <w:b w:val="0"/>
-          <w:i w:val="0"/>
-          <w:sz w:val="20"/>
-        </w:rPr>
-        <w:t>Screenshot da visão geral do Lobby central, mostrando o jogador em primeira pessoa e os quatro portais identificados pelas etiquetas Europa, Ásia, África e América.</w:t>
-      </w:r>
-    </w:p>
-    <w:p>
-      <w:pPr>
-        <w:jc w:val="both"/>
-      </w:pPr>
-      <w:r>
-        <w:rPr>
-          <w:b w:val="0"/>
-          <w:i w:val="0"/>
-        </w:rPr>
-        <w:t xml:space="preserve">O escopo está delimitado a uma versão </w:t>
-      </w:r>
-      <w:r>
-        <w:rPr>
-          <w:b w:val="0"/>
-          <w:i/>
-        </w:rPr>
-        <w:t>desktop-first</w:t>
-      </w:r>
-      <w:r>
-        <w:rPr>
-          <w:b w:val="0"/>
-          <w:i w:val="0"/>
-        </w:rPr>
-        <w:t xml:space="preserve">: a camada de interação utiliza mouse e teclado, e a câmera é controlada em primeira pessoa. Essa decisão permitiu concentrar esforço em três pilares: (i) a </w:t>
-      </w:r>
-      <w:r>
-        <w:rPr>
-          <w:b w:val="0"/>
-          <w:i/>
-        </w:rPr>
-        <w:t>arquitetura do sistema de narração</w:t>
-      </w:r>
-      <w:r>
-        <w:rPr>
-          <w:b w:val="0"/>
-          <w:i w:val="0"/>
-        </w:rPr>
-        <w:t xml:space="preserve">, capaz de iniciar, interromper, retomar e reiniciar histórias de forma coerente; (ii) a </w:t>
-      </w:r>
-      <w:r>
-        <w:rPr>
-          <w:b w:val="0"/>
-          <w:i/>
-        </w:rPr>
-        <w:t>integração de assets externos</w:t>
-      </w:r>
-      <w:r>
-        <w:rPr>
-          <w:b w:val="0"/>
-          <w:i w:val="0"/>
-        </w:rPr>
-        <w:t xml:space="preserve">, com foco em modelos exportados em formato GLB a partir do Blender; e (iii) a </w:t>
-      </w:r>
-      <w:r>
-        <w:rPr>
-          <w:b w:val="0"/>
-          <w:i/>
-        </w:rPr>
-        <w:t>navegação entre cenas</w:t>
-      </w:r>
-      <w:r>
-        <w:rPr>
-          <w:b w:val="0"/>
-          <w:i w:val="0"/>
-        </w:rPr>
-        <w:t>, mediada por portais interativos posicionados em uma cena central (</w:t>
-      </w:r>
-      <w:r>
-        <w:rPr>
-          <w:b w:val="0"/>
-          <w:i/>
-        </w:rPr>
-        <w:t>Lobby</w:t>
-      </w:r>
-      <w:r>
-        <w:rPr>
-          <w:b w:val="0"/>
-          <w:i w:val="0"/>
-        </w:rPr>
-        <w:t>). Uma camada imersiva em RV, com suporte a headsets, é prevista como evolução futura.</w:t>
-      </w:r>
-    </w:p>
-    <w:p>
-      <w:pPr>
-        <w:jc w:val="both"/>
-      </w:pPr>
-      <w:r>
-        <w:rPr>
-          <w:b w:val="0"/>
-          <w:i w:val="0"/>
-        </w:rPr>
-        <w:t xml:space="preserve">A motivação principal do projeto não está em demonstrar a fronteira técnica da RV, mas em construir uma base arquitetural sólida sobre a qual conteúdo educacional possa ser plugado: cada cena segue um mesmo padrão estrutural, variando apenas o ambiente, o modelo do NPC e os áudios das narrativas. Tal abordagem prioriza, conforme a filosofia adotada no projeto, </w:t>
-      </w:r>
-      <w:r>
-        <w:rPr>
-          <w:b w:val="0"/>
-          <w:i/>
-        </w:rPr>
-        <w:t>funcionar antes de embelezar</w:t>
-      </w:r>
-      <w:r>
-        <w:rPr>
-          <w:b w:val="0"/>
-          <w:i w:val="0"/>
-        </w:rPr>
-        <w:t xml:space="preserve"> — pressuposto que orientou todas as decisões de escopo descritas adiante.</w:t>
-      </w:r>
-    </w:p>
-    <w:p>
-      <w:pPr>
-        <w:jc w:val="both"/>
-      </w:pPr>
-      <w:r>
-        <w:rPr>
-          <w:b w:val="0"/>
-          <w:i w:val="0"/>
-        </w:rPr>
-        <w:t>A organização deste artigo se dá da seguinte forma. A Seção 2 contextualiza o trabalho frente à literatura sobre RV educacional e narrativa interativa. A Seção 3 descreve a metodologia adotada e a divisão de atividades. A Seção 4 detalha a implementação dos sistemas centrais. A Seção 5 apresenta os resultados obtidos no protótipo. A Seção 6 traz as considerações finais e identifica trabalhos futuros.</w:t>
-      </w:r>
-    </w:p>
-    <w:p>
-      <w:pPr>
-        <w:spacing w:before="240" w:after="120"/>
-      </w:pPr>
-      <w:r>
-        <w:rPr>
-          <w:b/>
-          <w:i w:val="0"/>
-          <w:color w:val="000000"/>
-          <w:sz w:val="26"/>
-        </w:rPr>
-        <w:t>2. Fundamentação Teórica e Trabalhos Relacionados</w:t>
-      </w:r>
-    </w:p>
-    <w:p>
-      <w:pPr>
-        <w:spacing w:before="240" w:after="120"/>
-      </w:pPr>
-      <w:r>
-        <w:rPr>
-          <w:b/>
-          <w:i w:val="0"/>
-          <w:color w:val="000000"/>
-          <w:sz w:val="24"/>
-        </w:rPr>
-        <w:t>2.1. Realidade Virtual e Educação</w:t>
-      </w:r>
-    </w:p>
-    <w:p>
-      <w:pPr>
-        <w:jc w:val="both"/>
-      </w:pPr>
-      <w:r>
-        <w:rPr>
-          <w:b w:val="0"/>
-          <w:i w:val="0"/>
-        </w:rPr>
-        <w:t>A Realidade Virtual pode ser entendida como um meio caracterizado pela combinação de três elementos fundamentais — imersão, interatividade e imaginação — os chamados "três Is" [Burdea e Coiffet 2003]. No contexto educacional, esses elementos têm sido explorados em aplicações que vão da simulação procedimental ao treinamento de habilidades comportamentais, com evidências de que ambientes imersivos podem aumentar o engajamento e a retenção de conteúdo [Freina e Ott 2015].</w:t>
-      </w:r>
-    </w:p>
-    <w:p>
-      <w:pPr>
-        <w:jc w:val="both"/>
-      </w:pPr>
-      <w:r>
-        <w:rPr>
-          <w:b w:val="0"/>
-          <w:i w:val="0"/>
-        </w:rPr>
-        <w:t xml:space="preserve">Especificamente em RV narrativa, a literatura discute o conceito de </w:t>
-      </w:r>
-      <w:r>
-        <w:rPr>
-          <w:b w:val="0"/>
-          <w:i/>
-        </w:rPr>
-        <w:t>agência</w:t>
-      </w:r>
-      <w:r>
-        <w:rPr>
-          <w:b w:val="0"/>
-          <w:i w:val="0"/>
-        </w:rPr>
-        <w:t xml:space="preserve"> enquanto sensação do usuário de que suas ações têm efeito significativo sobre o mundo [Murray 1997]. Mesmo em experiências contemplativas — nas quais o usuário não é protagonista de uma trama complexa — pequenos atos de interação, como aproximar-se, mirar e escolher quando iniciar uma narração, já contribuem para essa sensação. Esse é precisamente o tipo de agência mínima que orienta o design do </w:t>
-      </w:r>
-      <w:r>
-        <w:rPr>
-          <w:b w:val="0"/>
-          <w:i/>
-        </w:rPr>
-        <w:t>Explorando Histórias</w:t>
-      </w:r>
-      <w:r>
-        <w:rPr>
-          <w:b w:val="0"/>
-          <w:i w:val="0"/>
-        </w:rPr>
-        <w:t>: o usuário não decide o conteúdo da história, mas decide quando, em que ritmo e por quanto tempo escutá-la.</w:t>
-      </w:r>
-    </w:p>
-    <w:p>
-      <w:pPr>
-        <w:spacing w:before="240" w:after="120"/>
-      </w:pPr>
-      <w:r>
-        <w:rPr>
-          <w:b/>
-          <w:i w:val="0"/>
-          <w:color w:val="000000"/>
-          <w:sz w:val="24"/>
-        </w:rPr>
-        <w:t>2.2. Narrativa em Jogos e Storytelling Interativo</w:t>
-      </w:r>
-    </w:p>
-    <w:p>
-      <w:pPr>
-        <w:jc w:val="both"/>
-      </w:pPr>
-      <w:r>
-        <w:rPr>
-          <w:b w:val="0"/>
-          <w:i w:val="0"/>
-        </w:rPr>
-        <w:t>A literatura em design de jogos discute o equilíbrio entre regras, narrativa e experiência. [Schell 2008] propõe quatro elementos básicos — mecânica, estética, história e tecnologia — que devem dialogar de forma coerente. Em jogos de foco narrativo, a história não precisa ser ramificada para gerar engajamento; o engajamento pode emergir do controle temporal que o jogador exerce sobre a apresentação da narrativa, como ocorre neste trabalho.</w:t>
-      </w:r>
-    </w:p>
-    <w:p>
-      <w:pPr>
-        <w:jc w:val="both"/>
-      </w:pPr>
-      <w:r>
-        <w:rPr>
-          <w:b w:val="0"/>
-          <w:i w:val="0"/>
-        </w:rPr>
-        <w:t xml:space="preserve">[Salen e Zimmerman 2003] discutem o conceito de </w:t>
-      </w:r>
-      <w:r>
-        <w:rPr>
-          <w:b w:val="0"/>
-          <w:i/>
-        </w:rPr>
-        <w:t>jogo significativo</w:t>
-      </w:r>
-      <w:r>
-        <w:rPr>
-          <w:b w:val="0"/>
-          <w:i w:val="0"/>
-        </w:rPr>
-        <w:t xml:space="preserve"> (meaningful play), no qual cada ação do jogador é discernível e integrada ao sistema. Aplicado ao </w:t>
-      </w:r>
-      <w:r>
-        <w:rPr>
-          <w:b w:val="0"/>
-          <w:i/>
-        </w:rPr>
-        <w:t>Explorando Histórias</w:t>
-      </w:r>
-      <w:r>
-        <w:rPr>
-          <w:b w:val="0"/>
-          <w:i w:val="0"/>
-        </w:rPr>
-        <w:t>, esse princípio orienta o design da interação: a tecla de interação tem sempre uma resposta clara e contextualmente coerente — iniciar a história, interrompê-la (com um SFX de reação do NPC) ou retomá-la (com um SFX de retomada) — sem ambiguidade quanto ao estado atual do sistema.</w:t>
-      </w:r>
-    </w:p>
-    <w:p>
-      <w:pPr>
-        <w:spacing w:before="240" w:after="120"/>
-      </w:pPr>
-      <w:r>
-        <w:rPr>
-          <w:b/>
-          <w:i w:val="0"/>
-          <w:color w:val="000000"/>
-          <w:sz w:val="24"/>
-        </w:rPr>
-        <w:t>2.3. Trabalhos Relacionados</w:t>
-      </w:r>
-    </w:p>
-    <w:p>
-      <w:pPr>
-        <w:jc w:val="both"/>
-      </w:pPr>
-      <w:r>
-        <w:rPr>
-          <w:b w:val="0"/>
-          <w:i w:val="0"/>
-        </w:rPr>
-        <w:t xml:space="preserve">Trabalhos acadêmicos brasileiros têm explorado a RV em contextos educacionais. [Nipo et al. 2023] apresentam o </w:t>
-      </w:r>
-      <w:r>
-        <w:rPr>
-          <w:b w:val="0"/>
-          <w:i/>
-        </w:rPr>
-        <w:t>Robo-Think</w:t>
-      </w:r>
-      <w:r>
-        <w:rPr>
-          <w:b w:val="0"/>
-          <w:i w:val="0"/>
-        </w:rPr>
-        <w:t>, um jogo em RV para o ensino de habilidades de pensamento computacional, no qual o usuário interage com elementos tridimensionais em uma narrativa estruturada para gerar engajamento pedagógico. O trabalho ilustra como ambientes imersivos podem ser empregados para internalizar conteúdo de forma mais ativa do que abordagens tradicionais baseadas em texto.</w:t>
-      </w:r>
-    </w:p>
-    <w:p>
-      <w:pPr>
-        <w:jc w:val="both"/>
-      </w:pPr>
-      <w:r>
-        <w:rPr>
-          <w:b w:val="0"/>
-          <w:i w:val="0"/>
-        </w:rPr>
-        <w:t xml:space="preserve">O presente projeto se diferencia em três pontos principais: (i) adota a perspectiva </w:t>
-      </w:r>
-      <w:r>
-        <w:rPr>
-          <w:b w:val="0"/>
-          <w:i/>
-        </w:rPr>
-        <w:t>desktop-first</w:t>
-      </w:r>
-      <w:r>
-        <w:rPr>
-          <w:b w:val="0"/>
-          <w:i w:val="0"/>
-        </w:rPr>
-        <w:t xml:space="preserve"> como decisão de escopo, focando inicialmente na arquitetura e na qualidade do conteúdo narrativo, e reservando a adaptação para hardware imersivo como etapa subsequente; (ii) emprega vozes sintéticas geradas por TTS neural como mecanismo de produção rápida de narrativas em português brasileiro, sem dependência de gravações profissionais; e (iii) explora o folclore comparado entre continentes como eixo curatorial, em vez de focar em um único contexto cultural ou disciplinar.</w:t>
-      </w:r>
-    </w:p>
-    <w:p>
-      <w:pPr>
-        <w:spacing w:before="240" w:after="120"/>
-      </w:pPr>
-      <w:r>
-        <w:rPr>
-          <w:b/>
-          <w:i w:val="0"/>
-          <w:color w:val="000000"/>
-          <w:sz w:val="26"/>
-        </w:rPr>
-        <w:t>3. Metodologia</w:t>
-      </w:r>
-    </w:p>
-    <w:p>
-      <w:pPr>
-        <w:spacing w:before="240" w:after="120"/>
-      </w:pPr>
-      <w:r>
-        <w:rPr>
-          <w:b/>
-          <w:i w:val="0"/>
-          <w:color w:val="000000"/>
-          <w:sz w:val="24"/>
-        </w:rPr>
-        <w:t>3.1. Visão Geral do Processo</w:t>
-      </w:r>
-    </w:p>
-    <w:p>
-      <w:pPr>
-        <w:jc w:val="both"/>
-      </w:pPr>
-      <w:r>
-        <w:rPr>
-          <w:b w:val="0"/>
-          <w:i w:val="0"/>
-        </w:rPr>
-        <w:t>O desenvolvimento seguiu uma abordagem incremental orientada por entregas funcionais. Em vez de buscar um produto polido em um único ciclo, o projeto foi estruturado em iterações: cada iteração entregava uma capacidade nova e testável (movimentação básica, interação por raycast, máquina de estados de narração, integração de áudio, navegação entre cenas), permitindo validação contínua antes de avançar ao próximo bloco.</w:t>
-      </w:r>
-    </w:p>
-    <w:p>
-      <w:pPr>
-        <w:jc w:val="both"/>
-      </w:pPr>
-      <w:r>
-        <w:rPr>
-          <w:b w:val="0"/>
-          <w:i w:val="0"/>
-        </w:rPr>
-        <w:t xml:space="preserve">Os entregáveis intermediários foram organizados em três frentes que progrediram em paralelo: (i) construção dos </w:t>
-      </w:r>
-      <w:r>
-        <w:rPr>
-          <w:b w:val="0"/>
-          <w:i/>
-        </w:rPr>
-        <w:t>sistemas técnicos reutilizáveis</w:t>
-      </w:r>
-      <w:r>
-        <w:rPr>
-          <w:b w:val="0"/>
-          <w:i w:val="0"/>
-        </w:rPr>
-        <w:t xml:space="preserve"> — movimentação do jogador, sistema de interação e máquina de estados de narração; (ii) </w:t>
-      </w:r>
-      <w:r>
-        <w:rPr>
-          <w:b w:val="0"/>
-          <w:i/>
-        </w:rPr>
-        <w:t>produção de conteúdo</w:t>
-      </w:r>
-      <w:r>
-        <w:rPr>
-          <w:b w:val="0"/>
-          <w:i w:val="0"/>
-        </w:rPr>
-        <w:t xml:space="preserve"> — roteiros narrativos das histórias, geração dos áudios em TTS e seleção dos modelos 3D; e (iii) </w:t>
-      </w:r>
-      <w:r>
-        <w:rPr>
-          <w:b w:val="0"/>
-          <w:i/>
-        </w:rPr>
-        <w:t>montagem das cenas</w:t>
-      </w:r>
-      <w:r>
-        <w:rPr>
-          <w:b w:val="0"/>
-          <w:i w:val="0"/>
-        </w:rPr>
-        <w:t>, com integração dos dois pilares anteriores em ambientes coerentes com cada cultura.</w:t>
-      </w:r>
-    </w:p>
-    <w:p>
-      <w:pPr>
-        <w:spacing w:before="240" w:after="120"/>
-      </w:pPr>
-      <w:r>
-        <w:rPr>
-          <w:b/>
-          <w:i w:val="0"/>
-          <w:color w:val="000000"/>
-          <w:sz w:val="24"/>
-        </w:rPr>
-        <w:t>3.2. Stack Tecnológico</w:t>
-      </w:r>
-    </w:p>
-    <w:p>
-      <w:pPr>
-        <w:jc w:val="both"/>
-      </w:pPr>
-      <w:r>
-        <w:rPr>
-          <w:b w:val="0"/>
-          <w:i w:val="0"/>
-        </w:rPr>
-        <w:t xml:space="preserve">A engine escolhida foi o Unity 2022.3 LTS, na versão 2022.3.62f3, utilizando o </w:t>
-      </w:r>
-      <w:r>
-        <w:rPr>
-          <w:b w:val="0"/>
-          <w:i/>
-        </w:rPr>
-        <w:t>Built-in Render Pipeline</w:t>
-      </w:r>
-      <w:r>
-        <w:rPr>
-          <w:b w:val="0"/>
-          <w:i w:val="0"/>
-        </w:rPr>
-        <w:t>. A escolha priorizou estabilidade, ampla compatibilidade com assets de terceiros disponíveis na Asset Store e a curva de aprendizado já consolidada da equipe. O Unity foi também critério de viabilidade para a evolução futura prevista: o ecossistema de RV da engine, via XR Toolkit, oferece suporte nativo aos principais dispositivos imersivos do mercado.</w:t>
-      </w:r>
-    </w:p>
-    <w:p>
-      <w:pPr>
-        <w:jc w:val="both"/>
-      </w:pPr>
-      <w:r>
-        <w:rPr>
-          <w:b w:val="0"/>
-          <w:i w:val="0"/>
-        </w:rPr>
-        <w:t xml:space="preserve">A modelagem 3D dos personagens foi conduzida no Blender, com exportação para o formato </w:t>
-      </w:r>
-      <w:r>
-        <w:rPr>
-          <w:b/>
-          <w:i w:val="0"/>
-        </w:rPr>
-        <w:t>GLB</w:t>
-      </w:r>
-      <w:r>
-        <w:rPr>
-          <w:b w:val="0"/>
-          <w:i w:val="0"/>
-        </w:rPr>
-        <w:t xml:space="preserve">. Esse formato foi escolhido por ser leve, portátil e suportado nativamente pelo Unity por meio do </w:t>
-      </w:r>
-      <w:r>
-        <w:rPr>
-          <w:b w:val="0"/>
-          <w:i/>
-        </w:rPr>
-        <w:t>Scripted Importer</w:t>
-      </w:r>
-      <w:r>
-        <w:rPr>
-          <w:b w:val="0"/>
-          <w:i w:val="0"/>
-        </w:rPr>
-        <w:t xml:space="preserve"> de glTF. A organização do projeto contempla a futura migração para o formato FBX, caso seja necessária maior fidelidade em </w:t>
-      </w:r>
-      <w:r>
-        <w:rPr>
-          <w:b w:val="0"/>
-          <w:i/>
-        </w:rPr>
-        <w:t>rigging</w:t>
-      </w:r>
-      <w:r>
-        <w:rPr>
-          <w:b w:val="0"/>
-          <w:i w:val="0"/>
-        </w:rPr>
-        <w:t xml:space="preserve">, </w:t>
-      </w:r>
-      <w:r>
-        <w:rPr>
-          <w:b w:val="0"/>
-          <w:i/>
-        </w:rPr>
-        <w:t>UV mapping</w:t>
-      </w:r>
-      <w:r>
-        <w:rPr>
-          <w:b w:val="0"/>
-          <w:i w:val="0"/>
-        </w:rPr>
-        <w:t xml:space="preserve"> e </w:t>
-      </w:r>
-      <w:r>
-        <w:rPr>
-          <w:b w:val="0"/>
-          <w:i/>
-        </w:rPr>
-        <w:t>texturing</w:t>
-      </w:r>
-      <w:r>
-        <w:rPr>
-          <w:b w:val="0"/>
-          <w:i w:val="0"/>
-        </w:rPr>
-        <w:t>.</w:t>
-      </w:r>
-    </w:p>
-    <w:p>
-      <w:pPr>
-        <w:jc w:val="both"/>
-      </w:pPr>
-      <w:r>
-        <w:rPr>
-          <w:b w:val="0"/>
-          <w:i w:val="0"/>
-        </w:rPr>
-        <w:t xml:space="preserve">A produção dos áudios das narrativas foi realizada com a ferramenta </w:t>
-      </w:r>
-      <w:r>
-        <w:rPr>
-          <w:b/>
-          <w:i w:val="0"/>
-        </w:rPr>
-        <w:t>ElevenLabs</w:t>
-      </w:r>
-      <w:r>
-        <w:rPr>
-          <w:b w:val="0"/>
-          <w:i w:val="0"/>
-        </w:rPr>
-        <w:t>, que oferece síntese de voz neural em português brasileiro com timbres distintos. Cada voz foi selecionada manualmente para refletir o perfil cultural do NPC correspondente — uma voz masculina grave para o cavaleiro medieval, uma voz masculina regional para o Curupira, uma voz feminina suave para a gueixa e uma voz masculina dramática para o faraó. O uso de TTS neural foi uma decisão pragmática que viabilizou a produção de doze clipes de áudio (três por NPC: narrativa principal, SFX de interrupção e SFX de retomada) em tempo viável para o escopo acadêmico.</w:t>
-      </w:r>
-    </w:p>
-    <w:p>
-      <w:pPr>
-        <w:spacing w:before="240" w:after="120"/>
-      </w:pPr>
-      <w:r>
-        <w:rPr>
-          <w:b/>
-          <w:i w:val="0"/>
-          <w:color w:val="000000"/>
-          <w:sz w:val="24"/>
-        </w:rPr>
-        <w:t>3.3. Divisão de Atividades</w:t>
-      </w:r>
-    </w:p>
-    <w:p>
-      <w:pPr>
-        <w:jc w:val="both"/>
-      </w:pPr>
-      <w:r>
-        <w:rPr>
-          <w:b w:val="0"/>
-          <w:i w:val="0"/>
-        </w:rPr>
-        <w:t>O projeto foi desenvolvido em equipe, com atribuições distribuídas conforme a especialidade de cada membro:</w:t>
-      </w:r>
-    </w:p>
-    <w:p>
-      <w:pPr>
-        <w:pStyle w:val="ListBullet"/>
-      </w:pPr>
-      <w:r>
-        <w:rPr>
-          <w:b/>
-          <w:i w:val="0"/>
-        </w:rPr>
-        <w:t>Leonardo Buratto de Assis</w:t>
-      </w:r>
-      <w:r>
-        <w:rPr>
-          <w:b w:val="0"/>
-          <w:i w:val="0"/>
-        </w:rPr>
-        <w:t>: organização geral, planejamento técnico, implementação dos sistemas de movimentação, interação e narração, padrão de wrapper prefab para NPCs, sistema de portais e integração final das cenas.</w:t>
-      </w:r>
-    </w:p>
-    <w:p>
-      <w:pPr>
-        <w:pStyle w:val="ListBullet"/>
-      </w:pPr>
-      <w:r>
-        <w:rPr>
-          <w:b/>
-          <w:i w:val="0"/>
-        </w:rPr>
-        <w:t>Jennifer Leonora Galina Vieira</w:t>
-      </w:r>
-      <w:r>
-        <w:rPr>
-          <w:b w:val="0"/>
-          <w:i w:val="0"/>
-        </w:rPr>
-        <w:t>: pesquisa sobre os folclores e culturas representadas, definição e revisão das narrativas apresentadas pelos NPCs, validação cultural dos roteiros gerados.</w:t>
-      </w:r>
-    </w:p>
-    <w:p>
-      <w:pPr>
-        <w:pStyle w:val="ListBullet"/>
-      </w:pPr>
-      <w:r>
-        <w:rPr>
-          <w:b/>
-          <w:i w:val="0"/>
-        </w:rPr>
-        <w:t>Leonardo Conti</w:t>
-      </w:r>
-      <w:r>
-        <w:rPr>
-          <w:b w:val="0"/>
-          <w:i w:val="0"/>
-        </w:rPr>
-        <w:t>: definição do estilo visual, curadoria e organização dos modelos 3D coletados, organização da documentação do projeto e suporte à pesquisa cultural.</w:t>
-      </w:r>
-    </w:p>
-    <w:p>
-      <w:pPr>
-        <w:spacing w:before="240" w:after="120"/>
-      </w:pPr>
-      <w:r>
-        <w:rPr>
-          <w:b/>
-          <w:i w:val="0"/>
-          <w:color w:val="000000"/>
-          <w:sz w:val="26"/>
-        </w:rPr>
-        <w:t>4. Implementação</w:t>
-      </w:r>
-    </w:p>
-    <w:p>
-      <w:pPr>
-        <w:jc w:val="both"/>
-      </w:pPr>
-      <w:r>
-        <w:rPr>
-          <w:b w:val="0"/>
-          <w:i w:val="0"/>
-        </w:rPr>
-        <w:t>Esta seção descreve em detalhe os principais componentes do protótipo, com ênfase nas decisões arquiteturais que orientaram o código.</w:t>
-      </w:r>
-    </w:p>
-    <w:p>
-      <w:pPr>
-        <w:jc w:val="center"/>
-      </w:pPr>
-      <w:r>
         <w:drawing>
           <wp:inline xmlns:a="http://schemas.openxmlformats.org/drawingml/2006/main" xmlns:pic="http://schemas.openxmlformats.org/drawingml/2006/picture">
-            <wp:extent cx="5486400" cy="3584448"/>
+            <wp:extent cx="5486400" cy="2988682"/>
             <wp:docPr id="1" name="Picture 1"/>
             <wp:cNvGraphicFramePr>
               <a:graphicFrameLocks noChangeAspect="1"/>
@@ -940,7 +223,7 @@
               <a:graphicData uri="http://schemas.openxmlformats.org/drawingml/2006/picture">
                 <pic:pic>
                   <pic:nvPicPr>
-                    <pic:cNvPr id="0" name="fig2_arquitetura.png"/>
+                    <pic:cNvPr id="0" name="fig1_lobby.png"/>
                     <pic:cNvPicPr/>
                   </pic:nvPicPr>
                   <pic:blipFill>
@@ -952,7 +235,7 @@
                   <pic:spPr>
                     <a:xfrm>
                       <a:off x="0" y="0"/>
-                      <a:ext cx="5486400" cy="3584448"/>
+                      <a:ext cx="5486400" cy="2988682"/>
                     </a:xfrm>
                     <a:prstGeom prst="rect"/>
                   </pic:spPr>
@@ -973,7 +256,7 @@
           <w:b/>
           <w:sz w:val="20"/>
         </w:rPr>
-        <w:t xml:space="preserve">Figura 2. </w:t>
+        <w:t xml:space="preserve">Figura 1. </w:t>
       </w:r>
       <w:r>
         <w:rPr>
@@ -981,7 +264,127 @@
           <w:i w:val="0"/>
           <w:sz w:val="20"/>
         </w:rPr>
-        <w:t>Diagrama geral da arquitetura do sistema, mostrando as três camadas: (i) Player (movimentação + câmera + interação por raycast); (ii) NPC (wrapper prefab + máquina de estados de narração + áudio espacial); (iii) Sistema de navegação (portais + spawn contextual).</w:t>
+        <w:t>Screenshot da visão geral do Lobby central, mostrando o jogador em primeira pessoa e os quatro portais identificados pelas etiquetas Europa, Ásia, África e América.</w:t>
+      </w:r>
+    </w:p>
+    <w:p>
+      <w:pPr>
+        <w:jc w:val="both"/>
+      </w:pPr>
+      <w:r>
+        <w:rPr>
+          <w:b w:val="0"/>
+          <w:i w:val="0"/>
+        </w:rPr>
+        <w:t xml:space="preserve">O escopo está delimitado a uma versão </w:t>
+      </w:r>
+      <w:r>
+        <w:rPr>
+          <w:b w:val="0"/>
+          <w:i/>
+        </w:rPr>
+        <w:t>desktop-first</w:t>
+      </w:r>
+      <w:r>
+        <w:rPr>
+          <w:b w:val="0"/>
+          <w:i w:val="0"/>
+        </w:rPr>
+        <w:t xml:space="preserve">: a camada de interação utiliza mouse e teclado, e a câmera é controlada em primeira pessoa. Essa decisão permitiu concentrar esforço em três pilares: (i) a </w:t>
+      </w:r>
+      <w:r>
+        <w:rPr>
+          <w:b w:val="0"/>
+          <w:i/>
+        </w:rPr>
+        <w:t>arquitetura do sistema de narração</w:t>
+      </w:r>
+      <w:r>
+        <w:rPr>
+          <w:b w:val="0"/>
+          <w:i w:val="0"/>
+        </w:rPr>
+        <w:t xml:space="preserve">, capaz de iniciar, interromper, retomar e reiniciar histórias de forma coerente; (ii) a </w:t>
+      </w:r>
+      <w:r>
+        <w:rPr>
+          <w:b w:val="0"/>
+          <w:i/>
+        </w:rPr>
+        <w:t>integração de assets externos</w:t>
+      </w:r>
+      <w:r>
+        <w:rPr>
+          <w:b w:val="0"/>
+          <w:i w:val="0"/>
+        </w:rPr>
+        <w:t xml:space="preserve">, com foco em modelos exportados em formato GLB a partir do Blender; e (iii) a </w:t>
+      </w:r>
+      <w:r>
+        <w:rPr>
+          <w:b w:val="0"/>
+          <w:i/>
+        </w:rPr>
+        <w:t>navegação entre cenas</w:t>
+      </w:r>
+      <w:r>
+        <w:rPr>
+          <w:b w:val="0"/>
+          <w:i w:val="0"/>
+        </w:rPr>
+        <w:t>, mediada por portais interativos posicionados em uma cena central (</w:t>
+      </w:r>
+      <w:r>
+        <w:rPr>
+          <w:b w:val="0"/>
+          <w:i/>
+        </w:rPr>
+        <w:t>Lobby</w:t>
+      </w:r>
+      <w:r>
+        <w:rPr>
+          <w:b w:val="0"/>
+          <w:i w:val="0"/>
+        </w:rPr>
+        <w:t>). Uma camada imersiva em RV, com suporte a headsets, é prevista como evolução futura.</w:t>
+      </w:r>
+    </w:p>
+    <w:p>
+      <w:pPr>
+        <w:jc w:val="both"/>
+      </w:pPr>
+      <w:r>
+        <w:rPr>
+          <w:b w:val="0"/>
+          <w:i w:val="0"/>
+        </w:rPr>
+        <w:t xml:space="preserve">A motivação principal do projeto não está em demonstrar a fronteira técnica da RV, mas em construir uma base arquitetural sólida sobre a qual conteúdo educacional possa ser plugado: cada cena segue um mesmo padrão estrutural, variando apenas o ambiente, o modelo do NPC e os áudios das narrativas. Tal abordagem prioriza, conforme a filosofia adotada no projeto, </w:t>
+      </w:r>
+      <w:r>
+        <w:rPr>
+          <w:b w:val="0"/>
+          <w:i/>
+        </w:rPr>
+        <w:t>funcionar antes de embelezar</w:t>
+      </w:r>
+      <w:r>
+        <w:rPr>
+          <w:b w:val="0"/>
+          <w:i w:val="0"/>
+        </w:rPr>
+        <w:t xml:space="preserve"> — pressuposto que orientou todas as decisões de escopo descritas adiante.</w:t>
+      </w:r>
+    </w:p>
+    <w:p>
+      <w:pPr>
+        <w:jc w:val="both"/>
+      </w:pPr>
+      <w:r>
+        <w:rPr>
+          <w:b w:val="0"/>
+          <w:i w:val="0"/>
+        </w:rPr>
+        <w:t>A organização deste artigo se dá da seguinte forma. A Seção 2 contextualiza o trabalho frente à literatura sobre RV educacional e narrativa interativa. A Seção 3 descreve a metodologia adotada e a divisão de atividades. A Seção 4 detalha a implementação dos sistemas centrais. A Seção 5 apresenta os resultados obtidos no protótipo. A Seção 6 traz as considerações finais e identifica trabalhos futuros.</w:t>
       </w:r>
     </w:p>
     <w:p>
@@ -993,9 +396,23 @@
           <w:b/>
           <w:i w:val="0"/>
           <w:color w:val="000000"/>
+          <w:sz w:val="26"/>
+        </w:rPr>
+        <w:t>2. Fundamentação Teórica e Trabalhos Relacionados</w:t>
+      </w:r>
+    </w:p>
+    <w:p>
+      <w:pPr>
+        <w:spacing w:before="240" w:after="120"/>
+      </w:pPr>
+      <w:r>
+        <w:rPr>
+          <w:b/>
+          <w:i w:val="0"/>
+          <w:color w:val="000000"/>
           <w:sz w:val="24"/>
         </w:rPr>
-        <w:t>4.1. Sistema de Movimentação e Câmera em Primeira Pessoa</w:t>
+        <w:t>2.1. Realidade Virtual e Educação</w:t>
       </w:r>
     </w:p>
     <w:p>
@@ -1007,69 +424,7 @@
           <w:b w:val="0"/>
           <w:i w:val="0"/>
         </w:rPr>
-        <w:t xml:space="preserve">O jogador é representado por um </w:t>
-      </w:r>
-      <w:r>
-        <w:rPr>
-          <w:b w:val="0"/>
-          <w:i/>
-        </w:rPr>
-        <w:t>prefab</w:t>
-      </w:r>
-      <w:r>
-        <w:rPr>
-          <w:b w:val="0"/>
-          <w:i w:val="0"/>
-        </w:rPr>
-        <w:t xml:space="preserve"> contendo um </w:t>
-      </w:r>
-      <w:r>
-        <w:rPr>
-          <w:rFonts w:ascii="Consolas" w:hAnsi="Consolas"/>
-          <w:b w:val="0"/>
-          <w:i w:val="0"/>
-          <w:sz w:val="20"/>
-        </w:rPr>
-        <w:t>CharacterController</w:t>
-      </w:r>
-      <w:r>
-        <w:rPr>
-          <w:b w:val="0"/>
-          <w:i w:val="0"/>
-        </w:rPr>
-        <w:t xml:space="preserve"> e dois scripts principais: </w:t>
-      </w:r>
-      <w:r>
-        <w:rPr>
-          <w:rFonts w:ascii="Consolas" w:hAnsi="Consolas"/>
-          <w:b w:val="0"/>
-          <w:i w:val="0"/>
-          <w:sz w:val="20"/>
-        </w:rPr>
-        <w:t>PlayerMovementCC_2</w:t>
-      </w:r>
-      <w:r>
-        <w:rPr>
-          <w:b w:val="0"/>
-          <w:i w:val="0"/>
-        </w:rPr>
-        <w:t xml:space="preserve"> e </w:t>
-      </w:r>
-      <w:r>
-        <w:rPr>
-          <w:rFonts w:ascii="Consolas" w:hAnsi="Consolas"/>
-          <w:b w:val="0"/>
-          <w:i w:val="0"/>
-          <w:sz w:val="20"/>
-        </w:rPr>
-        <w:t>MouseLook360_2</w:t>
-      </w:r>
-      <w:r>
-        <w:rPr>
-          <w:b w:val="0"/>
-          <w:i w:val="0"/>
-        </w:rPr>
-        <w:t>.</w:t>
+        <w:t>A Realidade Virtual pode ser entendida como um meio caracterizado pela combinação de três elementos fundamentais — imersão, interatividade e imaginação — os chamados "três Is" [Burdea e Coiffet 2003]. No contexto educacional, esses elementos têm sido explorados em aplicações que vão da simulação procedimental ao treinamento de habilidades comportamentais, com evidências de que ambientes imersivos podem aumentar o engajamento e a retenção de conteúdo [Freina e Ott 2015].</w:t>
       </w:r>
     </w:p>
     <w:p>
@@ -1081,71 +436,49 @@
           <w:b w:val="0"/>
           <w:i w:val="0"/>
         </w:rPr>
-        <w:t xml:space="preserve">O componente </w:t>
-      </w:r>
-      <w:r>
-        <w:rPr>
-          <w:rFonts w:ascii="Consolas" w:hAnsi="Consolas"/>
+        <w:t xml:space="preserve">Especificamente em RV narrativa, a literatura discute o conceito de </w:t>
+      </w:r>
+      <w:r>
+        <w:rPr>
+          <w:b w:val="0"/>
+          <w:i/>
+        </w:rPr>
+        <w:t>agência</w:t>
+      </w:r>
+      <w:r>
+        <w:rPr>
           <w:b w:val="0"/>
           <w:i w:val="0"/>
-          <w:sz w:val="20"/>
-        </w:rPr>
-        <w:t>PlayerMovementCC_2</w:t>
+        </w:rPr>
+        <w:t xml:space="preserve"> enquanto sensação do usuário de que suas ações têm efeito significativo sobre o mundo [Murray 1997]. Mesmo em experiências contemplativas — nas quais o usuário não é protagonista de uma trama complexa — pequenos atos de interação, como aproximar-se, mirar e escolher quando iniciar uma narração, já contribuem para essa sensação. Esse é precisamente o tipo de agência mínima que orienta o design do </w:t>
+      </w:r>
+      <w:r>
+        <w:rPr>
+          <w:b w:val="0"/>
+          <w:i/>
+        </w:rPr>
+        <w:t>Explorando Histórias</w:t>
       </w:r>
       <w:r>
         <w:rPr>
           <w:b w:val="0"/>
           <w:i w:val="0"/>
         </w:rPr>
-        <w:t xml:space="preserve"> processa a entrada WASD do teclado, aplica gravidade contínua, implementa salto via </w:t>
-      </w:r>
-      <w:r>
-        <w:rPr>
-          <w:rFonts w:ascii="Consolas" w:hAnsi="Consolas"/>
-          <w:b w:val="0"/>
+        <w:t>: o usuário não decide o conteúdo da história, mas decide quando, em que ritmo e por quanto tempo escutá-la.</w:t>
+      </w:r>
+    </w:p>
+    <w:p>
+      <w:pPr>
+        <w:spacing w:before="240" w:after="120"/>
+      </w:pPr>
+      <w:r>
+        <w:rPr>
+          <w:b/>
           <w:i w:val="0"/>
-          <w:sz w:val="20"/>
-        </w:rPr>
-        <w:t>Space</w:t>
-      </w:r>
-      <w:r>
-        <w:rPr>
-          <w:b w:val="0"/>
-          <w:i w:val="0"/>
-        </w:rPr>
-        <w:t xml:space="preserve"> e suporta sprint via </w:t>
-      </w:r>
-      <w:r>
-        <w:rPr>
-          <w:rFonts w:ascii="Consolas" w:hAnsi="Consolas"/>
-          <w:b w:val="0"/>
-          <w:i w:val="0"/>
-          <w:sz w:val="20"/>
-        </w:rPr>
-        <w:t>Shift</w:t>
-      </w:r>
-      <w:r>
-        <w:rPr>
-          <w:b w:val="0"/>
-          <w:i w:val="0"/>
-        </w:rPr>
-        <w:t xml:space="preserve">. A movimentação é traduzida em chamadas a </w:t>
-      </w:r>
-      <w:r>
-        <w:rPr>
-          <w:rFonts w:ascii="Consolas" w:hAnsi="Consolas"/>
-          <w:b w:val="0"/>
-          <w:i w:val="0"/>
-          <w:sz w:val="20"/>
-        </w:rPr>
-        <w:t>CharacterController.Move</w:t>
-      </w:r>
-      <w:r>
-        <w:rPr>
-          <w:b w:val="0"/>
-          <w:i w:val="0"/>
-        </w:rPr>
-        <w:t>, o que garante interação correta com colisores do ambiente. Para evitar tremor vertical em superfícies planas, uma velocidade negativa residual é aplicada quando o jogador está em contato com o solo.</w:t>
+          <w:color w:val="000000"/>
+          <w:sz w:val="24"/>
+        </w:rPr>
+        <w:t>2.2. Narrativa em Jogos e Storytelling Interativo</w:t>
       </w:r>
     </w:p>
     <w:p>
@@ -1157,95 +490,7 @@
           <w:b w:val="0"/>
           <w:i w:val="0"/>
         </w:rPr>
-        <w:t xml:space="preserve">O componente </w:t>
-      </w:r>
-      <w:r>
-        <w:rPr>
-          <w:rFonts w:ascii="Consolas" w:hAnsi="Consolas"/>
-          <w:b w:val="0"/>
-          <w:i w:val="0"/>
-          <w:sz w:val="20"/>
-        </w:rPr>
-        <w:t>MouseLook360_2</w:t>
-      </w:r>
-      <w:r>
-        <w:rPr>
-          <w:b w:val="0"/>
-          <w:i w:val="0"/>
-        </w:rPr>
-        <w:t xml:space="preserve"> implementa a câmera em primeira pessoa por meio de uma separação clara: a rotação horizontal (</w:t>
-      </w:r>
-      <w:r>
-        <w:rPr>
-          <w:b w:val="0"/>
-          <w:i/>
-        </w:rPr>
-        <w:t>yaw</w:t>
-      </w:r>
-      <w:r>
-        <w:rPr>
-          <w:b w:val="0"/>
-          <w:i w:val="0"/>
-        </w:rPr>
-        <w:t>) é aplicada ao GameObject raiz do Player, enquanto a rotação vertical (</w:t>
-      </w:r>
-      <w:r>
-        <w:rPr>
-          <w:b w:val="0"/>
-          <w:i/>
-        </w:rPr>
-        <w:t>pitch</w:t>
-      </w:r>
-      <w:r>
-        <w:rPr>
-          <w:b w:val="0"/>
-          <w:i w:val="0"/>
-        </w:rPr>
-        <w:t xml:space="preserve">) é aplicada apenas ao Transform local da câmera, com </w:t>
-      </w:r>
-      <w:r>
-        <w:rPr>
-          <w:b w:val="0"/>
-          <w:i/>
-        </w:rPr>
-        <w:t>clamp</w:t>
-      </w:r>
-      <w:r>
-        <w:rPr>
-          <w:b w:val="0"/>
-          <w:i w:val="0"/>
-        </w:rPr>
-        <w:t xml:space="preserve"> de ±85 graus para evitar inversão. Essa separação garante que a movimentação WASD permaneça consistente com a orientação visual do usuário, e ao mesmo tempo desacopla a rotação vertical do corpo do personagem — exigência para uma futura integração com colisores não simétricos. Um </w:t>
-      </w:r>
-      <w:r>
-        <w:rPr>
-          <w:b w:val="0"/>
-          <w:i/>
-        </w:rPr>
-        <w:t>smoothing</w:t>
-      </w:r>
-      <w:r>
-        <w:rPr>
-          <w:b w:val="0"/>
-          <w:i w:val="0"/>
-        </w:rPr>
-        <w:t xml:space="preserve"> opcional, baseado em </w:t>
-      </w:r>
-      <w:r>
-        <w:rPr>
-          <w:rFonts w:ascii="Consolas" w:hAnsi="Consolas"/>
-          <w:b w:val="0"/>
-          <w:i w:val="0"/>
-          <w:sz w:val="20"/>
-        </w:rPr>
-        <w:t>SmoothDampAngle</w:t>
-      </w:r>
-      <w:r>
-        <w:rPr>
-          <w:b w:val="0"/>
-          <w:i w:val="0"/>
-        </w:rPr>
-        <w:t>, suaviza a câmera em ambientes de baixa taxa de quadros.</w:t>
+        <w:t>A literatura em design de jogos discute o equilíbrio entre regras, narrativa e experiência. [Schell 2008] propõe quatro elementos básicos — mecânica, estética, história e tecnologia — que devem dialogar de forma coerente. Em jogos de foco narrativo, a história não precisa ser ramificada para gerar engajamento; o engajamento pode emergir do controle temporal que o jogador exerce sobre a apresentação da narrativa, como ocorre neste trabalho.</w:t>
       </w:r>
     </w:p>
     <w:p>
@@ -1257,21 +502,35 @@
           <w:b w:val="0"/>
           <w:i w:val="0"/>
         </w:rPr>
-        <w:t xml:space="preserve">A câmera é posicionada na altura aproximada da linha dos olhos (1,7 metros relativo à origem do </w:t>
+        <w:t xml:space="preserve">[Salen e Zimmerman 2003] discutem o conceito de </w:t>
       </w:r>
       <w:r>
         <w:rPr>
           <w:b w:val="0"/>
           <w:i/>
         </w:rPr>
-        <w:t>prefab</w:t>
+        <w:t>jogo significativo</w:t>
       </w:r>
       <w:r>
         <w:rPr>
           <w:b w:val="0"/>
           <w:i w:val="0"/>
         </w:rPr>
-        <w:t>), refletindo uma escala realística de personagem humano.</w:t>
+        <w:t xml:space="preserve"> (meaningful play), no qual cada ação do jogador é discernível e integrada ao sistema. Aplicado ao </w:t>
+      </w:r>
+      <w:r>
+        <w:rPr>
+          <w:b w:val="0"/>
+          <w:i/>
+        </w:rPr>
+        <w:t>Explorando Histórias</w:t>
+      </w:r>
+      <w:r>
+        <w:rPr>
+          <w:b w:val="0"/>
+          <w:i w:val="0"/>
+        </w:rPr>
+        <w:t>, esse princípio orienta o design da interação: a tecla de interação tem sempre uma resposta clara e contextualmente coerente — iniciar a história, interrompê-la (com um SFX de reação do NPC) ou retomá-la (com um SFX de retomada) — sem ambiguidade quanto ao estado atual do sistema.</w:t>
       </w:r>
     </w:p>
     <w:p>
@@ -1285,7 +544,7 @@
           <w:color w:val="000000"/>
           <w:sz w:val="24"/>
         </w:rPr>
-        <w:t>4.2. Sistema de Interação por Raycasting</w:t>
+        <w:t>2.3. Trabalhos Relacionados</w:t>
       </w:r>
     </w:p>
     <w:p>
@@ -1297,175 +556,21 @@
           <w:b w:val="0"/>
           <w:i w:val="0"/>
         </w:rPr>
-        <w:t xml:space="preserve">O componente </w:t>
-      </w:r>
-      <w:r>
-        <w:rPr>
-          <w:rFonts w:ascii="Consolas" w:hAnsi="Consolas"/>
+        <w:t xml:space="preserve">Trabalhos acadêmicos brasileiros têm explorado a RV em contextos educacionais. [Nipo et al. 2023] apresentam o </w:t>
+      </w:r>
+      <w:r>
+        <w:rPr>
+          <w:b w:val="0"/>
+          <w:i/>
+        </w:rPr>
+        <w:t>Robo-Think</w:t>
+      </w:r>
+      <w:r>
+        <w:rPr>
           <w:b w:val="0"/>
           <w:i w:val="0"/>
-          <w:sz w:val="20"/>
-        </w:rPr>
-        <w:t>PlayerRayInteractor</w:t>
-      </w:r>
-      <w:r>
-        <w:rPr>
-          <w:b w:val="0"/>
-          <w:i w:val="0"/>
-        </w:rPr>
-        <w:t xml:space="preserve">, anexado à câmera do jogador, realiza, a cada frame, um </w:t>
-      </w:r>
-      <w:r>
-        <w:rPr>
-          <w:b w:val="0"/>
-          <w:i/>
-        </w:rPr>
-        <w:t>raycast</w:t>
-      </w:r>
-      <w:r>
-        <w:rPr>
-          <w:b w:val="0"/>
-          <w:i w:val="0"/>
-        </w:rPr>
-        <w:t xml:space="preserve"> a partir da posição da câmera na direção </w:t>
-      </w:r>
-      <w:r>
-        <w:rPr>
-          <w:b w:val="0"/>
-          <w:i/>
-        </w:rPr>
-        <w:t>forward</w:t>
-      </w:r>
-      <w:r>
-        <w:rPr>
-          <w:b w:val="0"/>
-          <w:i w:val="0"/>
-        </w:rPr>
-        <w:t xml:space="preserve">, com distância máxima parametrizável (4 metros no protótipo atual), filtrado pela camada </w:t>
-      </w:r>
-      <w:r>
-        <w:rPr>
-          <w:rFonts w:ascii="Consolas" w:hAnsi="Consolas"/>
-          <w:b w:val="0"/>
-          <w:i w:val="0"/>
-          <w:sz w:val="20"/>
-        </w:rPr>
-        <w:t>Interactable</w:t>
-      </w:r>
-      <w:r>
-        <w:rPr>
-          <w:b w:val="0"/>
-          <w:i w:val="0"/>
-        </w:rPr>
-        <w:t xml:space="preserve">. Quando o raycast atinge um objeto cujo componente raiz implementa a interface </w:t>
-      </w:r>
-      <w:r>
-        <w:rPr>
-          <w:rFonts w:ascii="Consolas" w:hAnsi="Consolas"/>
-          <w:b w:val="0"/>
-          <w:i w:val="0"/>
-          <w:sz w:val="20"/>
-        </w:rPr>
-        <w:t>IInteractable</w:t>
-      </w:r>
-      <w:r>
-        <w:rPr>
-          <w:b w:val="0"/>
-          <w:i w:val="0"/>
-        </w:rPr>
-        <w:t xml:space="preserve">, o </w:t>
-      </w:r>
-      <w:r>
-        <w:rPr>
-          <w:b w:val="0"/>
-          <w:i/>
-        </w:rPr>
-        <w:t>crosshair</w:t>
-      </w:r>
-      <w:r>
-        <w:rPr>
-          <w:b w:val="0"/>
-          <w:i w:val="0"/>
-        </w:rPr>
-        <w:t xml:space="preserve"> (renderizado em </w:t>
-      </w:r>
-      <w:r>
-        <w:rPr>
-          <w:b w:val="0"/>
-          <w:i/>
-        </w:rPr>
-        <w:t>Screen Space – Overlay</w:t>
-      </w:r>
-      <w:r>
-        <w:rPr>
-          <w:b w:val="0"/>
-          <w:i w:val="0"/>
-        </w:rPr>
-        <w:t xml:space="preserve">) muda de cor de branco para vermelho, sinalizando ao usuário que a interação está disponível. Ao pressionar a tecla </w:t>
-      </w:r>
-      <w:r>
-        <w:rPr>
-          <w:b/>
-          <w:i w:val="0"/>
-        </w:rPr>
-        <w:t>E</w:t>
-      </w:r>
-      <w:r>
-        <w:rPr>
-          <w:b w:val="0"/>
-          <w:i w:val="0"/>
-        </w:rPr>
-        <w:t xml:space="preserve">, o método </w:t>
-      </w:r>
-      <w:r>
-        <w:rPr>
-          <w:rFonts w:ascii="Consolas" w:hAnsi="Consolas"/>
-          <w:b w:val="0"/>
-          <w:i w:val="0"/>
-          <w:sz w:val="20"/>
-        </w:rPr>
-        <w:t>Interact()</w:t>
-      </w:r>
-      <w:r>
-        <w:rPr>
-          <w:b w:val="0"/>
-          <w:i w:val="0"/>
-        </w:rPr>
-        <w:t xml:space="preserve"> do objeto-alvo é invocado.</w:t>
-      </w:r>
-    </w:p>
-    <w:p>
-      <w:pPr>
-        <w:spacing w:before="160"/>
-        <w:jc w:val="center"/>
-      </w:pPr>
-      <w:r>
-        <w:rPr>
-          <w:i/>
-          <w:color w:val="808080"/>
-        </w:rPr>
-        <w:t>[  Figura 3: salve o screenshot como  figuras\fig3_crosshair.png  e rode md_to_docx.py novamente  ]</w:t>
-      </w:r>
-    </w:p>
-    <w:p>
-      <w:pPr>
-        <w:spacing w:before="80" w:after="200"/>
-        <w:jc w:val="center"/>
-      </w:pPr>
-      <w:r>
-        <w:rPr>
-          <w:b/>
-          <w:sz w:val="20"/>
-        </w:rPr>
-        <w:t xml:space="preserve">Figura 3. </w:t>
-      </w:r>
-      <w:r>
-        <w:rPr>
-          <w:b w:val="0"/>
-          <w:i w:val="0"/>
-          <w:sz w:val="20"/>
-        </w:rPr>
-        <w:t>Screenshot in-game mostrando o crosshair em estado normal (branco) ao apontar para o ambiente e em estado de destaque (vermelho) ao mirar em um NPC.</w:t>
+        </w:rPr>
+        <w:t>, um jogo em RV para o ensino de habilidades de pensamento computacional, no qual o usuário interage com elementos tridimensionais em uma narrativa estruturada para gerar engajamento pedagógico. O trabalho ilustra como ambientes imersivos podem ser empregados para internalizar conteúdo de forma mais ativa do que abordagens tradicionais baseadas em texto.</w:t>
       </w:r>
     </w:p>
     <w:p>
@@ -1477,63 +582,49 @@
           <w:b w:val="0"/>
           <w:i w:val="0"/>
         </w:rPr>
-        <w:t xml:space="preserve">Essa abordagem oferece três vantagens. Primeiro, permite que diferentes tipos de objetos — NPCs, portais entre cenas e, potencialmente, itens colecionáveis ou </w:t>
+        <w:t xml:space="preserve">O presente projeto se diferencia em três pontos principais: (i) adota a perspectiva </w:t>
       </w:r>
       <w:r>
         <w:rPr>
           <w:b w:val="0"/>
           <w:i/>
         </w:rPr>
-        <w:t>triggers</w:t>
+        <w:t>desktop-first</w:t>
       </w:r>
       <w:r>
         <w:rPr>
           <w:b w:val="0"/>
           <w:i w:val="0"/>
         </w:rPr>
-        <w:t xml:space="preserve"> ambientais — compartilhem a mesma camada de descoberta, sem duplicação de lógica de detecção. Segundo, desacopla totalmente a interação da física de colisão de proximidade, eliminando dependência de </w:t>
-      </w:r>
-      <w:r>
-        <w:rPr>
-          <w:b w:val="0"/>
-          <w:i/>
-        </w:rPr>
-        <w:t>triggers</w:t>
-      </w:r>
-      <w:r>
-        <w:rPr>
-          <w:b w:val="0"/>
+        <w:t xml:space="preserve"> como decisão de escopo, focando inicialmente na arquitetura e na qualidade do conteúdo narrativo, e reservando a adaptação para hardware imersivo como etapa subsequente; (ii) emprega vozes sintéticas geradas por TTS neural como mecanismo de produção rápida de narrativas em português brasileiro, sem dependência de gravações profissionais; e (iii) explora o folclore comparado entre continentes como eixo curatorial, em vez de focar em um único contexto cultural ou disciplinar.</w:t>
+      </w:r>
+    </w:p>
+    <w:p>
+      <w:pPr>
+        <w:spacing w:before="240" w:after="120"/>
+      </w:pPr>
+      <w:r>
+        <w:rPr>
+          <w:b/>
           <w:i w:val="0"/>
-        </w:rPr>
-        <w:t xml:space="preserve"> e </w:t>
-      </w:r>
-      <w:r>
-        <w:rPr>
-          <w:b w:val="0"/>
-          <w:i/>
-        </w:rPr>
-        <w:t>OnTriggerEnter</w:t>
-      </w:r>
-      <w:r>
-        <w:rPr>
-          <w:b w:val="0"/>
+          <w:color w:val="000000"/>
+          <w:sz w:val="26"/>
+        </w:rPr>
+        <w:t>3. Metodologia</w:t>
+      </w:r>
+    </w:p>
+    <w:p>
+      <w:pPr>
+        <w:spacing w:before="240" w:after="120"/>
+      </w:pPr>
+      <w:r>
+        <w:rPr>
+          <w:b/>
           <w:i w:val="0"/>
-        </w:rPr>
-        <w:t xml:space="preserve">. Terceiro, oferece </w:t>
-      </w:r>
-      <w:r>
-        <w:rPr>
-          <w:b w:val="0"/>
-          <w:i/>
-        </w:rPr>
-        <w:t>feedback</w:t>
-      </w:r>
-      <w:r>
-        <w:rPr>
-          <w:b w:val="0"/>
-          <w:i w:val="0"/>
-        </w:rPr>
-        <w:t xml:space="preserve"> visual claro: o crosshair como indicador de interação possível é uma convenção amplamente reconhecida pelo público de jogos em primeira pessoa.</w:t>
+          <w:color w:val="000000"/>
+          <w:sz w:val="24"/>
+        </w:rPr>
+        <w:t>3.1. Visão Geral do Processo</w:t>
       </w:r>
     </w:p>
     <w:p>
@@ -1545,38 +636,7 @@
           <w:b w:val="0"/>
           <w:i w:val="0"/>
         </w:rPr>
-        <w:t xml:space="preserve">A interface </w:t>
-      </w:r>
-      <w:r>
-        <w:rPr>
-          <w:rFonts w:ascii="Consolas" w:hAnsi="Consolas"/>
-          <w:b w:val="0"/>
-          <w:i w:val="0"/>
-          <w:sz w:val="20"/>
-        </w:rPr>
-        <w:t>IInteractable</w:t>
-      </w:r>
-      <w:r>
-        <w:rPr>
-          <w:b w:val="0"/>
-          <w:i w:val="0"/>
-        </w:rPr>
-        <w:t xml:space="preserve"> é definida da seguinte forma:</w:t>
-      </w:r>
-    </w:p>
-    <w:p>
-      <w:r>
-        <w:rPr>
-          <w:rFonts w:ascii="Consolas" w:hAnsi="Consolas"/>
-          <w:sz w:val="20"/>
-        </w:rPr>
-        <w:t>public interface IInteractable</w:t>
-        <w:br/>
-        <w:t>{</w:t>
-        <w:br/>
-        <w:t xml:space="preserve">    void Interact();</w:t>
-        <w:br/>
-        <w:t>}</w:t>
+        <w:t>O desenvolvimento seguiu uma abordagem incremental orientada por entregas funcionais. Em vez de buscar um produto polido em um único ciclo, o projeto foi estruturado em iterações: cada iteração entregava uma capacidade nova e testável (movimentação básica, interação por raycast, máquina de estados de narração, integração de áudio, navegação entre cenas), permitindo validação contínua antes de avançar ao próximo bloco.</w:t>
       </w:r>
     </w:p>
     <w:p>
@@ -1588,7 +648,49 @@
           <w:b w:val="0"/>
           <w:i w:val="0"/>
         </w:rPr>
-        <w:t>Sua simplicidade é intencional: o contrato mínimo permite que qualquer objeto que implemente essa interface seja descoberto e ativado pelo sistema, sem assumir nada sobre o que a interação faz internamente.</w:t>
+        <w:t xml:space="preserve">Os entregáveis intermediários foram organizados em três frentes que progrediram em paralelo: (i) construção dos </w:t>
+      </w:r>
+      <w:r>
+        <w:rPr>
+          <w:b w:val="0"/>
+          <w:i/>
+        </w:rPr>
+        <w:t>sistemas técnicos reutilizáveis</w:t>
+      </w:r>
+      <w:r>
+        <w:rPr>
+          <w:b w:val="0"/>
+          <w:i w:val="0"/>
+        </w:rPr>
+        <w:t xml:space="preserve"> — movimentação do jogador, sistema de interação e máquina de estados de narração; (ii) </w:t>
+      </w:r>
+      <w:r>
+        <w:rPr>
+          <w:b w:val="0"/>
+          <w:i/>
+        </w:rPr>
+        <w:t>produção de conteúdo</w:t>
+      </w:r>
+      <w:r>
+        <w:rPr>
+          <w:b w:val="0"/>
+          <w:i w:val="0"/>
+        </w:rPr>
+        <w:t xml:space="preserve"> — roteiros narrativos das histórias, geração dos áudios em TTS e seleção dos modelos 3D; e (iii) </w:t>
+      </w:r>
+      <w:r>
+        <w:rPr>
+          <w:b w:val="0"/>
+          <w:i/>
+        </w:rPr>
+        <w:t>montagem das cenas</w:t>
+      </w:r>
+      <w:r>
+        <w:rPr>
+          <w:b w:val="0"/>
+          <w:i w:val="0"/>
+        </w:rPr>
+        <w:t>, com integração dos dois pilares anteriores em ambientes coerentes com cada cultura.</w:t>
       </w:r>
     </w:p>
     <w:p>
@@ -1602,7 +704,7 @@
           <w:color w:val="000000"/>
           <w:sz w:val="24"/>
         </w:rPr>
-        <w:t>4.3. Sistema de Narração com Máquina de Estados</w:t>
+        <w:t>3.2. Stack Tecnológico</w:t>
       </w:r>
     </w:p>
     <w:p>
@@ -1614,23 +716,155 @@
           <w:b w:val="0"/>
           <w:i w:val="0"/>
         </w:rPr>
-        <w:t xml:space="preserve">O componente </w:t>
-      </w:r>
-      <w:r>
-        <w:rPr>
-          <w:rFonts w:ascii="Consolas" w:hAnsi="Consolas"/>
+        <w:t xml:space="preserve">A engine escolhida foi o Unity 2022.3 LTS, na versão 2022.3.62f3, utilizando o </w:t>
+      </w:r>
+      <w:r>
+        <w:rPr>
+          <w:b w:val="0"/>
+          <w:i/>
+        </w:rPr>
+        <w:t>Built-in Render Pipeline</w:t>
+      </w:r>
+      <w:r>
+        <w:rPr>
           <w:b w:val="0"/>
           <w:i w:val="0"/>
-          <w:sz w:val="20"/>
-        </w:rPr>
-        <w:t>NpcStory</w:t>
-      </w:r>
+        </w:rPr>
+        <w:t>. A escolha priorizou estabilidade, ampla compatibilidade com assets de terceiros disponíveis na Asset Store e a curva de aprendizado já consolidada da equipe. O Unity foi também critério de viabilidade para a evolução futura prevista: o ecossistema de RV da engine, via XR Toolkit, oferece suporte nativo aos principais dispositivos imersivos do mercado.</w:t>
+      </w:r>
+    </w:p>
+    <w:p>
+      <w:pPr>
+        <w:jc w:val="both"/>
+      </w:pPr>
       <w:r>
         <w:rPr>
           <w:b w:val="0"/>
           <w:i w:val="0"/>
         </w:rPr>
-        <w:t xml:space="preserve"> modela o comportamento de narração por meio de uma máquina de estados explícita com quatro estados:</w:t>
+        <w:t xml:space="preserve">A modelagem 3D dos personagens foi conduzida no Blender, com exportação para o formato </w:t>
+      </w:r>
+      <w:r>
+        <w:rPr>
+          <w:b/>
+          <w:i w:val="0"/>
+        </w:rPr>
+        <w:t>GLB</w:t>
+      </w:r>
+      <w:r>
+        <w:rPr>
+          <w:b w:val="0"/>
+          <w:i w:val="0"/>
+        </w:rPr>
+        <w:t xml:space="preserve">. Esse formato foi escolhido por ser leve, portátil e suportado nativamente pelo Unity por meio do </w:t>
+      </w:r>
+      <w:r>
+        <w:rPr>
+          <w:b w:val="0"/>
+          <w:i/>
+        </w:rPr>
+        <w:t>Scripted Importer</w:t>
+      </w:r>
+      <w:r>
+        <w:rPr>
+          <w:b w:val="0"/>
+          <w:i w:val="0"/>
+        </w:rPr>
+        <w:t xml:space="preserve"> de glTF. A organização do projeto contempla a futura migração para o formato FBX, caso seja necessária maior fidelidade em </w:t>
+      </w:r>
+      <w:r>
+        <w:rPr>
+          <w:b w:val="0"/>
+          <w:i/>
+        </w:rPr>
+        <w:t>rigging</w:t>
+      </w:r>
+      <w:r>
+        <w:rPr>
+          <w:b w:val="0"/>
+          <w:i w:val="0"/>
+        </w:rPr>
+        <w:t xml:space="preserve">, </w:t>
+      </w:r>
+      <w:r>
+        <w:rPr>
+          <w:b w:val="0"/>
+          <w:i/>
+        </w:rPr>
+        <w:t>UV mapping</w:t>
+      </w:r>
+      <w:r>
+        <w:rPr>
+          <w:b w:val="0"/>
+          <w:i w:val="0"/>
+        </w:rPr>
+        <w:t xml:space="preserve"> e </w:t>
+      </w:r>
+      <w:r>
+        <w:rPr>
+          <w:b w:val="0"/>
+          <w:i/>
+        </w:rPr>
+        <w:t>texturing</w:t>
+      </w:r>
+      <w:r>
+        <w:rPr>
+          <w:b w:val="0"/>
+          <w:i w:val="0"/>
+        </w:rPr>
+        <w:t>.</w:t>
+      </w:r>
+    </w:p>
+    <w:p>
+      <w:pPr>
+        <w:jc w:val="both"/>
+      </w:pPr>
+      <w:r>
+        <w:rPr>
+          <w:b w:val="0"/>
+          <w:i w:val="0"/>
+        </w:rPr>
+        <w:t xml:space="preserve">A produção dos áudios das narrativas foi realizada com a ferramenta </w:t>
+      </w:r>
+      <w:r>
+        <w:rPr>
+          <w:b/>
+          <w:i w:val="0"/>
+        </w:rPr>
+        <w:t>ElevenLabs</w:t>
+      </w:r>
+      <w:r>
+        <w:rPr>
+          <w:b w:val="0"/>
+          <w:i w:val="0"/>
+        </w:rPr>
+        <w:t>, que oferece síntese de voz neural em português brasileiro com timbres distintos. Cada voz foi selecionada manualmente para refletir o perfil cultural do NPC correspondente — uma voz masculina grave para o cavaleiro medieval, uma voz masculina regional para o Curupira, uma voz feminina suave para a gueixa e uma voz masculina dramática para o faraó. O uso de TTS neural foi uma decisão pragmática que viabilizou a produção de doze clipes de áudio (três por NPC: narrativa principal, SFX de interrupção e SFX de retomada) em tempo viável para o escopo acadêmico.</w:t>
+      </w:r>
+    </w:p>
+    <w:p>
+      <w:pPr>
+        <w:spacing w:before="240" w:after="120"/>
+      </w:pPr>
+      <w:r>
+        <w:rPr>
+          <w:b/>
+          <w:i w:val="0"/>
+          <w:color w:val="000000"/>
+          <w:sz w:val="24"/>
+        </w:rPr>
+        <w:t>3.3. Divisão de Atividades</w:t>
+      </w:r>
+    </w:p>
+    <w:p>
+      <w:pPr>
+        <w:jc w:val="both"/>
+      </w:pPr>
+      <w:r>
+        <w:rPr>
+          <w:b w:val="0"/>
+          <w:i w:val="0"/>
+        </w:rPr>
+        <w:t>O projeto foi desenvolvido em equipe, com atribuições distribuídas conforme a especialidade de cada membro:</w:t>
       </w:r>
     </w:p>
     <w:p>
@@ -1642,14 +876,14 @@
           <w:b/>
           <w:i w:val="0"/>
         </w:rPr>
-        <w:t>Idle</w:t>
+        <w:t>Leonardo Buratto de Assis</w:t>
       </w:r>
       <w:r>
         <w:rPr>
           <w:b w:val="0"/>
           <w:i w:val="0"/>
         </w:rPr>
-        <w:t>: o NPC está pronto para iniciar a história a partir do começo.</w:t>
+        <w:t>: organização geral, planejamento técnico, implementação dos sistemas de movimentação, interação e narração, padrão de wrapper prefab para NPCs, sistema de portais e integração final das cenas.</w:t>
       </w:r>
     </w:p>
     <w:p>
@@ -1661,14 +895,14 @@
           <w:b/>
           <w:i w:val="0"/>
         </w:rPr>
-        <w:t>PlayingStory</w:t>
+        <w:t>Jennifer Leonora Galina Vieira</w:t>
       </w:r>
       <w:r>
         <w:rPr>
           <w:b w:val="0"/>
           <w:i w:val="0"/>
         </w:rPr>
-        <w:t>: a narrativa principal está sendo reproduzida; uma nova interação irá pausá-la.</w:t>
+        <w:t>: pesquisa sobre os folclores e culturas representadas, definição e revisão das narrativas apresentadas pelos NPCs, validação cultural dos roteiros gerados.</w:t>
       </w:r>
     </w:p>
     <w:p>
@@ -1680,33 +914,28 @@
           <w:b/>
           <w:i w:val="0"/>
         </w:rPr>
-        <w:t>Paused</w:t>
+        <w:t>Leonardo Conti</w:t>
       </w:r>
       <w:r>
         <w:rPr>
           <w:b w:val="0"/>
           <w:i w:val="0"/>
         </w:rPr>
-        <w:t>: a história foi pausada e aguarda comando para retomar a partir do mesmo ponto.</w:t>
+        <w:t>: definição do estilo visual, curadoria e organização dos modelos 3D coletados, organização da documentação do projeto e suporte à pesquisa cultural.</w:t>
       </w:r>
     </w:p>
     <w:p>
       <w:pPr>
-        <w:pStyle w:val="ListBullet"/>
+        <w:spacing w:before="240" w:after="120"/>
       </w:pPr>
       <w:r>
         <w:rPr>
           <w:b/>
           <w:i w:val="0"/>
-        </w:rPr>
-        <w:t>PlayingSfx</w:t>
-      </w:r>
-      <w:r>
-        <w:rPr>
-          <w:b w:val="0"/>
-          <w:i w:val="0"/>
-        </w:rPr>
-        <w:t>: um efeito sonoro de reação (interrupção ou retomada) está sendo executado, e novas interações são ignoradas para evitar sobreposição.</w:t>
+          <w:color w:val="000000"/>
+          <w:sz w:val="26"/>
+        </w:rPr>
+        <w:t>4. Implementação</w:t>
       </w:r>
     </w:p>
     <w:p>
@@ -1718,7 +947,7 @@
           <w:b w:val="0"/>
           <w:i w:val="0"/>
         </w:rPr>
-        <w:t>A transição entre os estados é representada na Figura 4.</w:t>
+        <w:t>Esta seção descreve em detalhe os principais componentes do protótipo, com ênfase nas decisões arquiteturais que orientaram o código.</w:t>
       </w:r>
     </w:p>
     <w:p>
@@ -1737,7 +966,7 @@
               <a:graphicData uri="http://schemas.openxmlformats.org/drawingml/2006/picture">
                 <pic:pic>
                   <pic:nvPicPr>
-                    <pic:cNvPr id="0" name="fig4_maquina_estados.png"/>
+                    <pic:cNvPr id="0" name="fig2_arquitetura.png"/>
                     <pic:cNvPicPr/>
                   </pic:nvPicPr>
                   <pic:blipFill>
@@ -1770,7 +999,7 @@
           <w:b/>
           <w:sz w:val="20"/>
         </w:rPr>
-        <w:t xml:space="preserve">Figura 4. </w:t>
+        <w:t xml:space="preserve">Figura 2. </w:t>
       </w:r>
       <w:r>
         <w:rPr>
@@ -1778,143 +1007,21 @@
           <w:i w:val="0"/>
           <w:sz w:val="20"/>
         </w:rPr>
-        <w:t xml:space="preserve">Diagrama da máquina de estados do </w:t>
-      </w:r>
-      <w:r>
-        <w:rPr>
-          <w:rFonts w:ascii="Consolas" w:hAnsi="Consolas"/>
-          <w:b w:val="0"/>
+        <w:t>Diagrama geral da arquitetura do sistema, mostrando as três camadas: (i) Player (movimentação + câmera + interação por raycast); (ii) NPC (wrapper prefab + máquina de estados de narração + áudio espacial); (iii) Sistema de navegação (portais + spawn contextual).</w:t>
+      </w:r>
+    </w:p>
+    <w:p>
+      <w:pPr>
+        <w:spacing w:before="240" w:after="120"/>
+      </w:pPr>
+      <w:r>
+        <w:rPr>
+          <w:b/>
           <w:i w:val="0"/>
-          <w:sz w:val="16"/>
-        </w:rPr>
-        <w:t>NpcStory</w:t>
-      </w:r>
-      <w:r>
-        <w:rPr>
-          <w:b w:val="0"/>
-          <w:i w:val="0"/>
-          <w:sz w:val="20"/>
-        </w:rPr>
-        <w:t xml:space="preserve">, mostrando: </w:t>
-      </w:r>
-      <w:r>
-        <w:rPr>
-          <w:rFonts w:ascii="Consolas" w:hAnsi="Consolas"/>
-          <w:b w:val="0"/>
-          <w:i w:val="0"/>
-          <w:sz w:val="16"/>
-        </w:rPr>
-        <w:t>Idle</w:t>
-      </w:r>
-      <w:r>
-        <w:rPr>
-          <w:b w:val="0"/>
-          <w:i w:val="0"/>
-          <w:sz w:val="20"/>
-        </w:rPr>
-        <w:t xml:space="preserve"> → (interação) → </w:t>
-      </w:r>
-      <w:r>
-        <w:rPr>
-          <w:rFonts w:ascii="Consolas" w:hAnsi="Consolas"/>
-          <w:b w:val="0"/>
-          <w:i w:val="0"/>
-          <w:sz w:val="16"/>
-        </w:rPr>
-        <w:t>PlayingStory</w:t>
-      </w:r>
-      <w:r>
-        <w:rPr>
-          <w:b w:val="0"/>
-          <w:i w:val="0"/>
-          <w:sz w:val="20"/>
-        </w:rPr>
-        <w:t xml:space="preserve"> → (interação) → </w:t>
-      </w:r>
-      <w:r>
-        <w:rPr>
-          <w:rFonts w:ascii="Consolas" w:hAnsi="Consolas"/>
-          <w:b w:val="0"/>
-          <w:i w:val="0"/>
-          <w:sz w:val="16"/>
-        </w:rPr>
-        <w:t>PlayingSfx</w:t>
-      </w:r>
-      <w:r>
-        <w:rPr>
-          <w:b w:val="0"/>
-          <w:i w:val="0"/>
-          <w:sz w:val="20"/>
-        </w:rPr>
-        <w:t xml:space="preserve"> (interrupt) → </w:t>
-      </w:r>
-      <w:r>
-        <w:rPr>
-          <w:rFonts w:ascii="Consolas" w:hAnsi="Consolas"/>
-          <w:b w:val="0"/>
-          <w:i w:val="0"/>
-          <w:sz w:val="16"/>
-        </w:rPr>
-        <w:t>Paused</w:t>
-      </w:r>
-      <w:r>
-        <w:rPr>
-          <w:b w:val="0"/>
-          <w:i w:val="0"/>
-          <w:sz w:val="20"/>
-        </w:rPr>
-        <w:t xml:space="preserve"> → (interação) → </w:t>
-      </w:r>
-      <w:r>
-        <w:rPr>
-          <w:rFonts w:ascii="Consolas" w:hAnsi="Consolas"/>
-          <w:b w:val="0"/>
-          <w:i w:val="0"/>
-          <w:sz w:val="16"/>
-        </w:rPr>
-        <w:t>PlayingSfx</w:t>
-      </w:r>
-      <w:r>
-        <w:rPr>
-          <w:b w:val="0"/>
-          <w:i w:val="0"/>
-          <w:sz w:val="20"/>
-        </w:rPr>
-        <w:t xml:space="preserve"> (resume) → </w:t>
-      </w:r>
-      <w:r>
-        <w:rPr>
-          <w:rFonts w:ascii="Consolas" w:hAnsi="Consolas"/>
-          <w:b w:val="0"/>
-          <w:i w:val="0"/>
-          <w:sz w:val="16"/>
-        </w:rPr>
-        <w:t>PlayingStory</w:t>
-      </w:r>
-      <w:r>
-        <w:rPr>
-          <w:b w:val="0"/>
-          <w:i w:val="0"/>
-          <w:sz w:val="20"/>
-        </w:rPr>
-        <w:t xml:space="preserve"> → (fim natural) → </w:t>
-      </w:r>
-      <w:r>
-        <w:rPr>
-          <w:rFonts w:ascii="Consolas" w:hAnsi="Consolas"/>
-          <w:b w:val="0"/>
-          <w:i w:val="0"/>
-          <w:sz w:val="16"/>
-        </w:rPr>
-        <w:t>Idle</w:t>
-      </w:r>
-      <w:r>
-        <w:rPr>
-          <w:b w:val="0"/>
-          <w:i w:val="0"/>
-          <w:sz w:val="20"/>
-        </w:rPr>
-        <w:t>.</w:t>
+          <w:color w:val="000000"/>
+          <w:sz w:val="24"/>
+        </w:rPr>
+        <w:t>4.1. Sistema de Movimentação e Câmera em Primeira Pessoa</w:t>
       </w:r>
     </w:p>
     <w:p>
@@ -1926,7 +1033,21 @@
           <w:b w:val="0"/>
           <w:i w:val="0"/>
         </w:rPr>
-        <w:t>Cada NPC possui três clipes de áudio distintos: a narrativa principal (</w:t>
+        <w:t xml:space="preserve">O jogador é representado por um </w:t>
+      </w:r>
+      <w:r>
+        <w:rPr>
+          <w:b w:val="0"/>
+          <w:i/>
+        </w:rPr>
+        <w:t>prefab</w:t>
+      </w:r>
+      <w:r>
+        <w:rPr>
+          <w:b w:val="0"/>
+          <w:i w:val="0"/>
+        </w:rPr>
+        <w:t xml:space="preserve"> contendo um </w:t>
       </w:r>
       <w:r>
         <w:rPr>
@@ -1935,14 +1056,46 @@
           <w:i w:val="0"/>
           <w:sz w:val="20"/>
         </w:rPr>
-        <w:t>storyClip</w:t>
+        <w:t>CharacterController</w:t>
       </w:r>
       <w:r>
         <w:rPr>
           <w:b w:val="0"/>
           <w:i w:val="0"/>
         </w:rPr>
-        <w:t>), um SFX curto de interrupção (por exemplo, "Alguma dúvida?", proferido pelo personagem) e um SFX de retomada (por exemplo, "Continuando..."). Esses SFX foram concebidos como reações naturais do narrador às ações do usuário, reforçando a impressão de interlocução genuína em vez de mera reprodução automática.</w:t>
+        <w:t xml:space="preserve"> e dois scripts principais: </w:t>
+      </w:r>
+      <w:r>
+        <w:rPr>
+          <w:rFonts w:ascii="Consolas" w:hAnsi="Consolas"/>
+          <w:b w:val="0"/>
+          <w:i w:val="0"/>
+          <w:sz w:val="20"/>
+        </w:rPr>
+        <w:t>PlayerMovementCC_2</w:t>
+      </w:r>
+      <w:r>
+        <w:rPr>
+          <w:b w:val="0"/>
+          <w:i w:val="0"/>
+        </w:rPr>
+        <w:t xml:space="preserve"> e </w:t>
+      </w:r>
+      <w:r>
+        <w:rPr>
+          <w:rFonts w:ascii="Consolas" w:hAnsi="Consolas"/>
+          <w:b w:val="0"/>
+          <w:i w:val="0"/>
+          <w:sz w:val="20"/>
+        </w:rPr>
+        <w:t>MouseLook360_2</w:t>
+      </w:r>
+      <w:r>
+        <w:rPr>
+          <w:b w:val="0"/>
+          <w:i w:val="0"/>
+        </w:rPr>
+        <w:t>.</w:t>
       </w:r>
     </w:p>
     <w:p>
@@ -1954,7 +1107,7 @@
           <w:b w:val="0"/>
           <w:i w:val="0"/>
         </w:rPr>
-        <w:t xml:space="preserve">A implementação utiliza dois </w:t>
+        <w:t xml:space="preserve">O componente </w:t>
       </w:r>
       <w:r>
         <w:rPr>
@@ -1963,14 +1116,14 @@
           <w:i w:val="0"/>
           <w:sz w:val="20"/>
         </w:rPr>
-        <w:t>AudioSources</w:t>
+        <w:t>PlayerMovementCC_2</w:t>
       </w:r>
       <w:r>
         <w:rPr>
           <w:b w:val="0"/>
           <w:i w:val="0"/>
         </w:rPr>
-        <w:t xml:space="preserve"> distintos, criados em tempo de execução: um dedicado à narrativa principal — para permitir </w:t>
+        <w:t xml:space="preserve"> processa a entrada WASD do teclado, aplica gravidade contínua, implementa salto via </w:t>
       </w:r>
       <w:r>
         <w:rPr>
@@ -1979,14 +1132,14 @@
           <w:i w:val="0"/>
           <w:sz w:val="20"/>
         </w:rPr>
-        <w:t>Pause()</w:t>
+        <w:t>Space</w:t>
       </w:r>
       <w:r>
         <w:rPr>
           <w:b w:val="0"/>
           <w:i w:val="0"/>
         </w:rPr>
-        <w:t xml:space="preserve"> e </w:t>
+        <w:t xml:space="preserve"> e suporta sprint via </w:t>
       </w:r>
       <w:r>
         <w:rPr>
@@ -1995,14 +1148,14 @@
           <w:i w:val="0"/>
           <w:sz w:val="20"/>
         </w:rPr>
-        <w:t>UnPause()</w:t>
+        <w:t>Shift</w:t>
       </w:r>
       <w:r>
         <w:rPr>
           <w:b w:val="0"/>
           <w:i w:val="0"/>
         </w:rPr>
-        <w:t xml:space="preserve"> sem perder a posição temporal — e outro para os SFX, evitando que a reprodução de um SFX interfira no tempo de reprodução da história. Essa separação é uma decisão arquitetural deliberada: a tentativa inicial de utilizar um único </w:t>
+        <w:t xml:space="preserve">. A movimentação é traduzida em chamadas a </w:t>
       </w:r>
       <w:r>
         <w:rPr>
@@ -2011,14 +1164,14 @@
           <w:i w:val="0"/>
           <w:sz w:val="20"/>
         </w:rPr>
-        <w:t>AudioSource</w:t>
+        <w:t>CharacterController.Move</w:t>
       </w:r>
       <w:r>
         <w:rPr>
           <w:b w:val="0"/>
           <w:i w:val="0"/>
         </w:rPr>
-        <w:t xml:space="preserve"> levou a comportamentos indesejados nos quais o SFX sobrescrevia o estado de reprodução da narrativa principal.</w:t>
+        <w:t>, o que garante interação correta com colisores do ambiente. Para evitar tremor vertical em superfícies planas, uma velocidade negativa residual é aplicada quando o jogador está em contato com o solo.</w:t>
       </w:r>
     </w:p>
     <w:p>
@@ -2030,7 +1183,7 @@
           <w:b w:val="0"/>
           <w:i w:val="0"/>
         </w:rPr>
-        <w:t>O áudio é configurado como espacial (</w:t>
+        <w:t xml:space="preserve">O componente </w:t>
       </w:r>
       <w:r>
         <w:rPr>
@@ -2039,14 +1192,112 @@
           <w:i w:val="0"/>
           <w:sz w:val="20"/>
         </w:rPr>
-        <w:t>spatialBlend = 1</w:t>
+        <w:t>MouseLook360_2</w:t>
       </w:r>
       <w:r>
         <w:rPr>
           <w:b w:val="0"/>
           <w:i w:val="0"/>
         </w:rPr>
-        <w:t>), de modo que a percepção sonora do usuário é coerente com a posição do NPC no espaço tridimensional — afastando-se do NPC, o som atenua de forma realística.</w:t>
+        <w:t xml:space="preserve"> implementa a câmera em primeira pessoa por meio de uma separação clara: a rotação horizontal (</w:t>
+      </w:r>
+      <w:r>
+        <w:rPr>
+          <w:b w:val="0"/>
+          <w:i/>
+        </w:rPr>
+        <w:t>yaw</w:t>
+      </w:r>
+      <w:r>
+        <w:rPr>
+          <w:b w:val="0"/>
+          <w:i w:val="0"/>
+        </w:rPr>
+        <w:t>) é aplicada ao GameObject raiz do Player, enquanto a rotação vertical (</w:t>
+      </w:r>
+      <w:r>
+        <w:rPr>
+          <w:b w:val="0"/>
+          <w:i/>
+        </w:rPr>
+        <w:t>pitch</w:t>
+      </w:r>
+      <w:r>
+        <w:rPr>
+          <w:b w:val="0"/>
+          <w:i w:val="0"/>
+        </w:rPr>
+        <w:t xml:space="preserve">) é aplicada apenas ao Transform local da câmera, com </w:t>
+      </w:r>
+      <w:r>
+        <w:rPr>
+          <w:b w:val="0"/>
+          <w:i/>
+        </w:rPr>
+        <w:t>clamp</w:t>
+      </w:r>
+      <w:r>
+        <w:rPr>
+          <w:b w:val="0"/>
+          <w:i w:val="0"/>
+        </w:rPr>
+        <w:t xml:space="preserve"> de ±85 graus para evitar inversão. Essa separação garante que a movimentação WASD permaneça consistente com a orientação visual do usuário, e ao mesmo tempo desacopla a rotação vertical do corpo do personagem — exigência para uma futura integração com colisores não simétricos. Um </w:t>
+      </w:r>
+      <w:r>
+        <w:rPr>
+          <w:b w:val="0"/>
+          <w:i/>
+        </w:rPr>
+        <w:t>smoothing</w:t>
+      </w:r>
+      <w:r>
+        <w:rPr>
+          <w:b w:val="0"/>
+          <w:i w:val="0"/>
+        </w:rPr>
+        <w:t xml:space="preserve"> opcional, baseado em </w:t>
+      </w:r>
+      <w:r>
+        <w:rPr>
+          <w:rFonts w:ascii="Consolas" w:hAnsi="Consolas"/>
+          <w:b w:val="0"/>
+          <w:i w:val="0"/>
+          <w:sz w:val="20"/>
+        </w:rPr>
+        <w:t>SmoothDampAngle</w:t>
+      </w:r>
+      <w:r>
+        <w:rPr>
+          <w:b w:val="0"/>
+          <w:i w:val="0"/>
+        </w:rPr>
+        <w:t>, suaviza a câmera em ambientes de baixa taxa de quadros.</w:t>
+      </w:r>
+    </w:p>
+    <w:p>
+      <w:pPr>
+        <w:jc w:val="both"/>
+      </w:pPr>
+      <w:r>
+        <w:rPr>
+          <w:b w:val="0"/>
+          <w:i w:val="0"/>
+        </w:rPr>
+        <w:t xml:space="preserve">A câmera é posicionada na altura aproximada da linha dos olhos (1,7 metros relativo à origem do </w:t>
+      </w:r>
+      <w:r>
+        <w:rPr>
+          <w:b w:val="0"/>
+          <w:i/>
+        </w:rPr>
+        <w:t>prefab</w:t>
+      </w:r>
+      <w:r>
+        <w:rPr>
+          <w:b w:val="0"/>
+          <w:i w:val="0"/>
+        </w:rPr>
+        <w:t>), refletindo uma escala realística de personagem humano.</w:t>
       </w:r>
     </w:p>
     <w:p>
@@ -2060,7 +1311,7 @@
           <w:color w:val="000000"/>
           <w:sz w:val="24"/>
         </w:rPr>
-        <w:t>4.4. Padrão Wrapper Prefab para Modelos GLB</w:t>
+        <w:t>4.2. Sistema de Interação por Raycasting</w:t>
       </w:r>
     </w:p>
     <w:p>
@@ -2072,33 +1323,125 @@
           <w:b w:val="0"/>
           <w:i w:val="0"/>
         </w:rPr>
-        <w:t xml:space="preserve">A engine Unity impõe restrições sobre a edição direta de hierarquias importadas a partir de arquivos GLB: não é possível adicionar componentes diretamente ao GameObject raiz do modelo importado, pois esse raiz é considerado imutável pelo importador. Para contornar essa limitação sem comprometer a integração com o pipeline do Blender, adotou-se o padrão </w:t>
+        <w:t xml:space="preserve">O componente </w:t>
+      </w:r>
+      <w:r>
+        <w:rPr>
+          <w:rFonts w:ascii="Consolas" w:hAnsi="Consolas"/>
+          <w:b w:val="0"/>
+          <w:i w:val="0"/>
+          <w:sz w:val="20"/>
+        </w:rPr>
+        <w:t>PlayerRayInteractor</w:t>
+      </w:r>
+      <w:r>
+        <w:rPr>
+          <w:b w:val="0"/>
+          <w:i w:val="0"/>
+        </w:rPr>
+        <w:t xml:space="preserve">, anexado à câmera do jogador, realiza, a cada frame, um </w:t>
+      </w:r>
+      <w:r>
+        <w:rPr>
+          <w:b w:val="0"/>
+          <w:i/>
+        </w:rPr>
+        <w:t>raycast</w:t>
+      </w:r>
+      <w:r>
+        <w:rPr>
+          <w:b w:val="0"/>
+          <w:i w:val="0"/>
+        </w:rPr>
+        <w:t xml:space="preserve"> a partir da posição da câmera na direção </w:t>
+      </w:r>
+      <w:r>
+        <w:rPr>
+          <w:b w:val="0"/>
+          <w:i/>
+        </w:rPr>
+        <w:t>forward</w:t>
+      </w:r>
+      <w:r>
+        <w:rPr>
+          <w:b w:val="0"/>
+          <w:i w:val="0"/>
+        </w:rPr>
+        <w:t xml:space="preserve">, com distância máxima parametrizável (4 metros no protótipo atual), filtrado pela camada </w:t>
+      </w:r>
+      <w:r>
+        <w:rPr>
+          <w:rFonts w:ascii="Consolas" w:hAnsi="Consolas"/>
+          <w:b w:val="0"/>
+          <w:i w:val="0"/>
+          <w:sz w:val="20"/>
+        </w:rPr>
+        <w:t>Interactable</w:t>
+      </w:r>
+      <w:r>
+        <w:rPr>
+          <w:b w:val="0"/>
+          <w:i w:val="0"/>
+        </w:rPr>
+        <w:t xml:space="preserve">. Quando o raycast atinge um objeto cujo componente raiz implementa a interface </w:t>
+      </w:r>
+      <w:r>
+        <w:rPr>
+          <w:rFonts w:ascii="Consolas" w:hAnsi="Consolas"/>
+          <w:b w:val="0"/>
+          <w:i w:val="0"/>
+          <w:sz w:val="20"/>
+        </w:rPr>
+        <w:t>IInteractable</w:t>
+      </w:r>
+      <w:r>
+        <w:rPr>
+          <w:b w:val="0"/>
+          <w:i w:val="0"/>
+        </w:rPr>
+        <w:t xml:space="preserve">, o </w:t>
+      </w:r>
+      <w:r>
+        <w:rPr>
+          <w:b w:val="0"/>
+          <w:i/>
+        </w:rPr>
+        <w:t>crosshair</w:t>
+      </w:r>
+      <w:r>
+        <w:rPr>
+          <w:b w:val="0"/>
+          <w:i w:val="0"/>
+        </w:rPr>
+        <w:t xml:space="preserve"> (renderizado em </w:t>
+      </w:r>
+      <w:r>
+        <w:rPr>
+          <w:b w:val="0"/>
+          <w:i/>
+        </w:rPr>
+        <w:t>Screen Space – Overlay</w:t>
+      </w:r>
+      <w:r>
+        <w:rPr>
+          <w:b w:val="0"/>
+          <w:i w:val="0"/>
+        </w:rPr>
+        <w:t xml:space="preserve">) muda de cor de branco para vermelho, sinalizando ao usuário que a interação está disponível. Ao pressionar a tecla </w:t>
       </w:r>
       <w:r>
         <w:rPr>
           <w:b/>
           <w:i w:val="0"/>
         </w:rPr>
-        <w:t>wrapper prefab</w:t>
+        <w:t>E</w:t>
       </w:r>
       <w:r>
         <w:rPr>
           <w:b w:val="0"/>
           <w:i w:val="0"/>
         </w:rPr>
-        <w:t>.</w:t>
-      </w:r>
-    </w:p>
-    <w:p>
-      <w:pPr>
-        <w:jc w:val="both"/>
-      </w:pPr>
-      <w:r>
-        <w:rPr>
-          <w:b w:val="0"/>
-          <w:i w:val="0"/>
-        </w:rPr>
-        <w:t>Nesse padrão, um GameObject vazio na cena assume o papel de raiz funcional, carregando os componentes lógicos (</w:t>
+        <w:t xml:space="preserve">, o método </w:t>
       </w:r>
       <w:r>
         <w:rPr>
@@ -2107,87 +1450,14 @@
           <w:i w:val="0"/>
           <w:sz w:val="20"/>
         </w:rPr>
-        <w:t>NpcStory</w:t>
+        <w:t>Interact()</w:t>
       </w:r>
       <w:r>
         <w:rPr>
           <w:b w:val="0"/>
           <w:i w:val="0"/>
         </w:rPr>
-        <w:t xml:space="preserve">, </w:t>
-      </w:r>
-      <w:r>
-        <w:rPr>
-          <w:rFonts w:ascii="Consolas" w:hAnsi="Consolas"/>
-          <w:b w:val="0"/>
-          <w:i w:val="0"/>
-          <w:sz w:val="20"/>
-        </w:rPr>
-        <w:t>BoxCollider</w:t>
-      </w:r>
-      <w:r>
-        <w:rPr>
-          <w:b w:val="0"/>
-          <w:i w:val="0"/>
-        </w:rPr>
-        <w:t xml:space="preserve">, </w:t>
-      </w:r>
-      <w:r>
-        <w:rPr>
-          <w:rFonts w:ascii="Consolas" w:hAnsi="Consolas"/>
-          <w:b w:val="0"/>
-          <w:i w:val="0"/>
-          <w:sz w:val="20"/>
-        </w:rPr>
-        <w:t>AudioSource</w:t>
-      </w:r>
-      <w:r>
-        <w:rPr>
-          <w:b w:val="0"/>
-          <w:i w:val="0"/>
-        </w:rPr>
-        <w:t xml:space="preserve"> e a </w:t>
-      </w:r>
-      <w:r>
-        <w:rPr>
-          <w:b w:val="0"/>
-          <w:i/>
-        </w:rPr>
-        <w:t>layer</w:t>
-      </w:r>
-      <w:r>
-        <w:rPr>
-          <w:b w:val="0"/>
-          <w:i w:val="0"/>
-        </w:rPr>
-        <w:t xml:space="preserve"> </w:t>
-      </w:r>
-      <w:r>
-        <w:rPr>
-          <w:rFonts w:ascii="Consolas" w:hAnsi="Consolas"/>
-          <w:b w:val="0"/>
-          <w:i w:val="0"/>
-          <w:sz w:val="20"/>
-        </w:rPr>
-        <w:t>Interactable</w:t>
-      </w:r>
-      <w:r>
-        <w:rPr>
-          <w:b w:val="0"/>
-          <w:i w:val="0"/>
-        </w:rPr>
-        <w:t>), enquanto o GLB é incorporado como filho desse wrapper. Visualmente, a hierarquia é a seguinte:</w:t>
-      </w:r>
-    </w:p>
-    <w:p>
-      <w:r>
-        <w:rPr>
-          <w:rFonts w:ascii="Consolas" w:hAnsi="Consolas"/>
-          <w:sz w:val="20"/>
-        </w:rPr>
-        <w:t>NPC_Root (Layer: Interactable, BoxCollider, NpcStory, AudioSource)</w:t>
-        <w:br/>
-        <w:t>└── GLB_Model (Knight, Pharaoh, Geisha ou Curupira)</w:t>
+        <w:t xml:space="preserve"> do objeto-alvo é invocado.</w:t>
       </w:r>
     </w:p>
     <w:p>
@@ -2200,7 +1470,7 @@
           <w:i/>
           <w:color w:val="808080"/>
         </w:rPr>
-        <w:t>[  Figura 5: salve o screenshot como  figuras\fig5_hierarchy.png  e rode md_to_docx.py novamente  ]</w:t>
+        <w:t>[  Figura 3: salve o screenshot como  figuras\fig3_crosshair.png  e rode md_to_docx.py novamente  ]</w:t>
       </w:r>
     </w:p>
     <w:p>
@@ -2213,7 +1483,7 @@
           <w:b/>
           <w:sz w:val="20"/>
         </w:rPr>
-        <w:t xml:space="preserve">Figura 5. </w:t>
+        <w:t xml:space="preserve">Figura 3. </w:t>
       </w:r>
       <w:r>
         <w:rPr>
@@ -2221,7 +1491,7 @@
           <w:i w:val="0"/>
           <w:sz w:val="20"/>
         </w:rPr>
-        <w:t>Screenshot da janela Hierarchy do Unity Editor, mostrando a estrutura wrapper prefab aplicada a um dos NPCs. Ao lado, o painel Inspector destacando os componentes anexados ao GameObject raiz.</w:t>
+        <w:t>Screenshot in-game mostrando o crosshair em estado normal (branco) ao apontar para o ambiente e em estado de destaque (vermelho) ao mirar em um NPC.</w:t>
       </w:r>
     </w:p>
     <w:p>
@@ -2233,21 +1503,75 @@
           <w:b w:val="0"/>
           <w:i w:val="0"/>
         </w:rPr>
-        <w:t xml:space="preserve">Esse padrão isola a configuração lógica do conteúdo visual, permitindo que a substituição de um modelo — por exemplo, durante iteração artística ou migração para FBX — não exija reconfiguração dos componentes funcionais. A </w:t>
+        <w:t xml:space="preserve">Essa abordagem oferece três vantagens. Primeiro, permite que diferentes tipos de objetos — NPCs, portais entre cenas e, potencialmente, itens colecionáveis ou </w:t>
       </w:r>
       <w:r>
         <w:rPr>
           <w:b w:val="0"/>
           <w:i/>
         </w:rPr>
-        <w:t>layer</w:t>
+        <w:t>triggers</w:t>
       </w:r>
       <w:r>
         <w:rPr>
           <w:b w:val="0"/>
           <w:i w:val="0"/>
         </w:rPr>
-        <w:t xml:space="preserve"> </w:t>
+        <w:t xml:space="preserve"> ambientais — compartilhem a mesma camada de descoberta, sem duplicação de lógica de detecção. Segundo, desacopla totalmente a interação da física de colisão de proximidade, eliminando dependência de </w:t>
+      </w:r>
+      <w:r>
+        <w:rPr>
+          <w:b w:val="0"/>
+          <w:i/>
+        </w:rPr>
+        <w:t>triggers</w:t>
+      </w:r>
+      <w:r>
+        <w:rPr>
+          <w:b w:val="0"/>
+          <w:i w:val="0"/>
+        </w:rPr>
+        <w:t xml:space="preserve"> e </w:t>
+      </w:r>
+      <w:r>
+        <w:rPr>
+          <w:b w:val="0"/>
+          <w:i/>
+        </w:rPr>
+        <w:t>OnTriggerEnter</w:t>
+      </w:r>
+      <w:r>
+        <w:rPr>
+          <w:b w:val="0"/>
+          <w:i w:val="0"/>
+        </w:rPr>
+        <w:t xml:space="preserve">. Terceiro, oferece </w:t>
+      </w:r>
+      <w:r>
+        <w:rPr>
+          <w:b w:val="0"/>
+          <w:i/>
+        </w:rPr>
+        <w:t>feedback</w:t>
+      </w:r>
+      <w:r>
+        <w:rPr>
+          <w:b w:val="0"/>
+          <w:i w:val="0"/>
+        </w:rPr>
+        <w:t xml:space="preserve"> visual claro: o crosshair como indicador de interação possível é uma convenção amplamente reconhecida pelo público de jogos em primeira pessoa.</w:t>
+      </w:r>
+    </w:p>
+    <w:p>
+      <w:pPr>
+        <w:jc w:val="both"/>
+      </w:pPr>
+      <w:r>
+        <w:rPr>
+          <w:b w:val="0"/>
+          <w:i w:val="0"/>
+        </w:rPr>
+        <w:t xml:space="preserve">A interface </w:t>
       </w:r>
       <w:r>
         <w:rPr>
@@ -2256,46 +1580,41 @@
           <w:i w:val="0"/>
           <w:sz w:val="20"/>
         </w:rPr>
-        <w:t>Interactable</w:t>
+        <w:t>IInteractable</w:t>
       </w:r>
       <w:r>
         <w:rPr>
           <w:b w:val="0"/>
           <w:i w:val="0"/>
         </w:rPr>
-        <w:t xml:space="preserve"> aplicada ao wrapper garante que o raycast do </w:t>
-      </w:r>
+        <w:t xml:space="preserve"> é definida da seguinte forma:</w:t>
+      </w:r>
+    </w:p>
+    <w:p>
       <w:r>
         <w:rPr>
           <w:rFonts w:ascii="Consolas" w:hAnsi="Consolas"/>
+          <w:sz w:val="20"/>
+        </w:rPr>
+        <w:t>public interface IInteractable</w:t>
+        <w:br/>
+        <w:t>{</w:t>
+        <w:br/>
+        <w:t xml:space="preserve">    void Interact();</w:t>
+        <w:br/>
+        <w:t>}</w:t>
+      </w:r>
+    </w:p>
+    <w:p>
+      <w:pPr>
+        <w:jc w:val="both"/>
+      </w:pPr>
+      <w:r>
+        <w:rPr>
           <w:b w:val="0"/>
           <w:i w:val="0"/>
-          <w:sz w:val="20"/>
-        </w:rPr>
-        <w:t>PlayerRayInteractor</w:t>
-      </w:r>
-      <w:r>
-        <w:rPr>
-          <w:b w:val="0"/>
-          <w:i w:val="0"/>
-        </w:rPr>
-        <w:t xml:space="preserve"> detecte o NPC mesmo quando o usuário aponta diretamente para a malha do modelo, graças à propagação de hits para o componente raiz via </w:t>
-      </w:r>
-      <w:r>
-        <w:rPr>
-          <w:rFonts w:ascii="Consolas" w:hAnsi="Consolas"/>
-          <w:b w:val="0"/>
-          <w:i w:val="0"/>
-          <w:sz w:val="20"/>
-        </w:rPr>
-        <w:t>GetComponentInParent&lt;IInteractable&gt;()</w:t>
-      </w:r>
-      <w:r>
-        <w:rPr>
-          <w:b w:val="0"/>
-          <w:i w:val="0"/>
-        </w:rPr>
-        <w:t>.</w:t>
+        </w:rPr>
+        <w:t>Sua simplicidade é intencional: o contrato mínimo permite que qualquer objeto que implemente essa interface seja descoberto e ativado pelo sistema, sem assumir nada sobre o que a interação faz internamente.</w:t>
       </w:r>
     </w:p>
     <w:p>
@@ -2309,7 +1628,7 @@
           <w:color w:val="000000"/>
           <w:sz w:val="24"/>
         </w:rPr>
-        <w:t>4.5. Navegação entre Cenas via Portais Interativos</w:t>
+        <w:t>4.3. Sistema de Narração com Máquina de Estados</w:t>
       </w:r>
     </w:p>
     <w:p>
@@ -2321,21 +1640,7 @@
           <w:b w:val="0"/>
           <w:i w:val="0"/>
         </w:rPr>
-        <w:t>A navegação entre as quatro cenas-continente e a cena central (</w:t>
-      </w:r>
-      <w:r>
-        <w:rPr>
-          <w:b w:val="0"/>
-          <w:i/>
-        </w:rPr>
-        <w:t>Lobby</w:t>
-      </w:r>
-      <w:r>
-        <w:rPr>
-          <w:b w:val="0"/>
-          <w:i w:val="0"/>
-        </w:rPr>
-        <w:t xml:space="preserve">) é mediada por portais físicos no ambiente. Cada portal é um GameObject contendo um </w:t>
+        <w:t xml:space="preserve">O componente </w:t>
       </w:r>
       <w:r>
         <w:rPr>
@@ -2344,78 +1649,90 @@
           <w:i w:val="0"/>
           <w:sz w:val="20"/>
         </w:rPr>
-        <w:t>BoxCollider</w:t>
+        <w:t>NpcStory</w:t>
       </w:r>
       <w:r>
         <w:rPr>
           <w:b w:val="0"/>
           <w:i w:val="0"/>
         </w:rPr>
-        <w:t xml:space="preserve"> na camada </w:t>
-      </w:r>
-      <w:r>
-        <w:rPr>
-          <w:rFonts w:ascii="Consolas" w:hAnsi="Consolas"/>
-          <w:b w:val="0"/>
+        <w:t xml:space="preserve"> modela o comportamento de narração por meio de uma máquina de estados explícita com quatro estados:</w:t>
+      </w:r>
+    </w:p>
+    <w:p>
+      <w:pPr>
+        <w:pStyle w:val="ListBullet"/>
+      </w:pPr>
+      <w:r>
+        <w:rPr>
+          <w:b/>
           <w:i w:val="0"/>
-          <w:sz w:val="20"/>
-        </w:rPr>
-        <w:t>Interactable</w:t>
+        </w:rPr>
+        <w:t>Idle</w:t>
       </w:r>
       <w:r>
         <w:rPr>
           <w:b w:val="0"/>
           <w:i w:val="0"/>
         </w:rPr>
-        <w:t xml:space="preserve"> e o componente </w:t>
-      </w:r>
-      <w:r>
-        <w:rPr>
-          <w:rFonts w:ascii="Consolas" w:hAnsi="Consolas"/>
-          <w:b w:val="0"/>
+        <w:t>: o NPC está pronto para iniciar a história a partir do começo.</w:t>
+      </w:r>
+    </w:p>
+    <w:p>
+      <w:pPr>
+        <w:pStyle w:val="ListBullet"/>
+      </w:pPr>
+      <w:r>
+        <w:rPr>
+          <w:b/>
           <w:i w:val="0"/>
-          <w:sz w:val="20"/>
-        </w:rPr>
-        <w:t>ScenePortal</w:t>
+        </w:rPr>
+        <w:t>PlayingStory</w:t>
       </w:r>
       <w:r>
         <w:rPr>
           <w:b w:val="0"/>
           <w:i w:val="0"/>
         </w:rPr>
-        <w:t xml:space="preserve">, que implementa </w:t>
-      </w:r>
-      <w:r>
-        <w:rPr>
-          <w:rFonts w:ascii="Consolas" w:hAnsi="Consolas"/>
-          <w:b w:val="0"/>
+        <w:t>: a narrativa principal está sendo reproduzida; uma nova interação irá pausá-la.</w:t>
+      </w:r>
+    </w:p>
+    <w:p>
+      <w:pPr>
+        <w:pStyle w:val="ListBullet"/>
+      </w:pPr>
+      <w:r>
+        <w:rPr>
+          <w:b/>
           <w:i w:val="0"/>
-          <w:sz w:val="20"/>
-        </w:rPr>
-        <w:t>IInteractable</w:t>
+        </w:rPr>
+        <w:t>Paused</w:t>
       </w:r>
       <w:r>
         <w:rPr>
           <w:b w:val="0"/>
           <w:i w:val="0"/>
         </w:rPr>
-        <w:t xml:space="preserve">. Ao ser ativado pelo jogador, o portal registra em uma variável estática a cena de origem e invoca </w:t>
-      </w:r>
-      <w:r>
-        <w:rPr>
-          <w:rFonts w:ascii="Consolas" w:hAnsi="Consolas"/>
-          <w:b w:val="0"/>
+        <w:t>: a história foi pausada e aguarda comando para retomar a partir do mesmo ponto.</w:t>
+      </w:r>
+    </w:p>
+    <w:p>
+      <w:pPr>
+        <w:pStyle w:val="ListBullet"/>
+      </w:pPr>
+      <w:r>
+        <w:rPr>
+          <w:b/>
           <w:i w:val="0"/>
-          <w:sz w:val="20"/>
-        </w:rPr>
-        <w:t>SceneManager.LoadScene</w:t>
+        </w:rPr>
+        <w:t>PlayingSfx</w:t>
       </w:r>
       <w:r>
         <w:rPr>
           <w:b w:val="0"/>
           <w:i w:val="0"/>
         </w:rPr>
-        <w:t xml:space="preserve"> com o nome da cena de destino.</w:t>
+        <w:t>: um efeito sonoro de reação (interrupção ou retomada) está sendo executado, e novas interações são ignoradas para evitar sobreposição.</w:t>
       </w:r>
     </w:p>
     <w:p>
@@ -2427,62 +1744,823 @@
           <w:b w:val="0"/>
           <w:i w:val="0"/>
         </w:rPr>
-        <w:t xml:space="preserve">A cena central, </w:t>
-      </w:r>
-      <w:r>
-        <w:rPr>
-          <w:b w:val="0"/>
-          <w:i/>
-        </w:rPr>
-        <w:t>Scene_Lobby</w:t>
-      </w:r>
-      <w:r>
-        <w:rPr>
-          <w:b w:val="0"/>
-          <w:i w:val="0"/>
-        </w:rPr>
-        <w:t>, contém quatro portais — um para cada continente — dispostos em torno do ponto de spawn inicial do jogador. Cada portal é identificado por uma etiqueta tridimensional (</w:t>
-      </w:r>
-      <w:r>
-        <w:rPr>
-          <w:b w:val="0"/>
-          <w:i/>
-        </w:rPr>
-        <w:t>TextMesh</w:t>
-      </w:r>
-      <w:r>
-        <w:rPr>
-          <w:b w:val="0"/>
-          <w:i w:val="0"/>
-        </w:rPr>
-        <w:t xml:space="preserve">) posicionada acima dele, com comportamento de </w:t>
-      </w:r>
-      <w:r>
-        <w:rPr>
-          <w:b w:val="0"/>
-          <w:i/>
-        </w:rPr>
-        <w:t>billboard</w:t>
-      </w:r>
-      <w:r>
-        <w:rPr>
-          <w:b w:val="0"/>
-          <w:i w:val="0"/>
-        </w:rPr>
-        <w:t>: a etiqueta gira em torno do eixo vertical para sempre apresentar sua face frontal à câmera do jogador, garantindo legibilidade independentemente do ângulo de aproximação.</w:t>
+        <w:t>A transição entre os estados é representada na Figura 4.</w:t>
       </w:r>
     </w:p>
     <w:p>
       <w:pPr>
-        <w:spacing w:before="160"/>
         <w:jc w:val="center"/>
       </w:pPr>
       <w:r>
-        <w:rPr>
+        <w:drawing>
+          <wp:inline xmlns:a="http://schemas.openxmlformats.org/drawingml/2006/main" xmlns:pic="http://schemas.openxmlformats.org/drawingml/2006/picture">
+            <wp:extent cx="5486400" cy="3584448"/>
+            <wp:docPr id="3" name="Picture 3"/>
+            <wp:cNvGraphicFramePr>
+              <a:graphicFrameLocks noChangeAspect="1"/>
+            </wp:cNvGraphicFramePr>
+            <a:graphic>
+              <a:graphicData uri="http://schemas.openxmlformats.org/drawingml/2006/picture">
+                <pic:pic>
+                  <pic:nvPicPr>
+                    <pic:cNvPr id="0" name="fig4_maquina_estados.png"/>
+                    <pic:cNvPicPr/>
+                  </pic:nvPicPr>
+                  <pic:blipFill>
+                    <a:blip r:embed="rId11"/>
+                    <a:stretch>
+                      <a:fillRect/>
+                    </a:stretch>
+                  </pic:blipFill>
+                  <pic:spPr>
+                    <a:xfrm>
+                      <a:off x="0" y="0"/>
+                      <a:ext cx="5486400" cy="3584448"/>
+                    </a:xfrm>
+                    <a:prstGeom prst="rect"/>
+                  </pic:spPr>
+                </pic:pic>
+              </a:graphicData>
+            </a:graphic>
+          </wp:inline>
+        </w:drawing>
+      </w:r>
+    </w:p>
+    <w:p>
+      <w:pPr>
+        <w:spacing w:before="80" w:after="200"/>
+        <w:jc w:val="center"/>
+      </w:pPr>
+      <w:r>
+        <w:rPr>
+          <w:b/>
+          <w:sz w:val="20"/>
+        </w:rPr>
+        <w:t xml:space="preserve">Figura 4. </w:t>
+      </w:r>
+      <w:r>
+        <w:rPr>
+          <w:b w:val="0"/>
+          <w:i w:val="0"/>
+          <w:sz w:val="20"/>
+        </w:rPr>
+        <w:t xml:space="preserve">Diagrama da máquina de estados do </w:t>
+      </w:r>
+      <w:r>
+        <w:rPr>
+          <w:rFonts w:ascii="Consolas" w:hAnsi="Consolas"/>
+          <w:b w:val="0"/>
+          <w:i w:val="0"/>
+          <w:sz w:val="16"/>
+        </w:rPr>
+        <w:t>NpcStory</w:t>
+      </w:r>
+      <w:r>
+        <w:rPr>
+          <w:b w:val="0"/>
+          <w:i w:val="0"/>
+          <w:sz w:val="20"/>
+        </w:rPr>
+        <w:t xml:space="preserve">, mostrando: </w:t>
+      </w:r>
+      <w:r>
+        <w:rPr>
+          <w:rFonts w:ascii="Consolas" w:hAnsi="Consolas"/>
+          <w:b w:val="0"/>
+          <w:i w:val="0"/>
+          <w:sz w:val="16"/>
+        </w:rPr>
+        <w:t>Idle</w:t>
+      </w:r>
+      <w:r>
+        <w:rPr>
+          <w:b w:val="0"/>
+          <w:i w:val="0"/>
+          <w:sz w:val="20"/>
+        </w:rPr>
+        <w:t xml:space="preserve"> → (interação) → </w:t>
+      </w:r>
+      <w:r>
+        <w:rPr>
+          <w:rFonts w:ascii="Consolas" w:hAnsi="Consolas"/>
+          <w:b w:val="0"/>
+          <w:i w:val="0"/>
+          <w:sz w:val="16"/>
+        </w:rPr>
+        <w:t>PlayingStory</w:t>
+      </w:r>
+      <w:r>
+        <w:rPr>
+          <w:b w:val="0"/>
+          <w:i w:val="0"/>
+          <w:sz w:val="20"/>
+        </w:rPr>
+        <w:t xml:space="preserve"> → (interação) → </w:t>
+      </w:r>
+      <w:r>
+        <w:rPr>
+          <w:rFonts w:ascii="Consolas" w:hAnsi="Consolas"/>
+          <w:b w:val="0"/>
+          <w:i w:val="0"/>
+          <w:sz w:val="16"/>
+        </w:rPr>
+        <w:t>PlayingSfx</w:t>
+      </w:r>
+      <w:r>
+        <w:rPr>
+          <w:b w:val="0"/>
+          <w:i w:val="0"/>
+          <w:sz w:val="20"/>
+        </w:rPr>
+        <w:t xml:space="preserve"> (interrupt) → </w:t>
+      </w:r>
+      <w:r>
+        <w:rPr>
+          <w:rFonts w:ascii="Consolas" w:hAnsi="Consolas"/>
+          <w:b w:val="0"/>
+          <w:i w:val="0"/>
+          <w:sz w:val="16"/>
+        </w:rPr>
+        <w:t>Paused</w:t>
+      </w:r>
+      <w:r>
+        <w:rPr>
+          <w:b w:val="0"/>
+          <w:i w:val="0"/>
+          <w:sz w:val="20"/>
+        </w:rPr>
+        <w:t xml:space="preserve"> → (interação) → </w:t>
+      </w:r>
+      <w:r>
+        <w:rPr>
+          <w:rFonts w:ascii="Consolas" w:hAnsi="Consolas"/>
+          <w:b w:val="0"/>
+          <w:i w:val="0"/>
+          <w:sz w:val="16"/>
+        </w:rPr>
+        <w:t>PlayingSfx</w:t>
+      </w:r>
+      <w:r>
+        <w:rPr>
+          <w:b w:val="0"/>
+          <w:i w:val="0"/>
+          <w:sz w:val="20"/>
+        </w:rPr>
+        <w:t xml:space="preserve"> (resume) → </w:t>
+      </w:r>
+      <w:r>
+        <w:rPr>
+          <w:rFonts w:ascii="Consolas" w:hAnsi="Consolas"/>
+          <w:b w:val="0"/>
+          <w:i w:val="0"/>
+          <w:sz w:val="16"/>
+        </w:rPr>
+        <w:t>PlayingStory</w:t>
+      </w:r>
+      <w:r>
+        <w:rPr>
+          <w:b w:val="0"/>
+          <w:i w:val="0"/>
+          <w:sz w:val="20"/>
+        </w:rPr>
+        <w:t xml:space="preserve"> → (fim natural) → </w:t>
+      </w:r>
+      <w:r>
+        <w:rPr>
+          <w:rFonts w:ascii="Consolas" w:hAnsi="Consolas"/>
+          <w:b w:val="0"/>
+          <w:i w:val="0"/>
+          <w:sz w:val="16"/>
+        </w:rPr>
+        <w:t>Idle</w:t>
+      </w:r>
+      <w:r>
+        <w:rPr>
+          <w:b w:val="0"/>
+          <w:i w:val="0"/>
+          <w:sz w:val="20"/>
+        </w:rPr>
+        <w:t>.</w:t>
+      </w:r>
+    </w:p>
+    <w:p>
+      <w:pPr>
+        <w:jc w:val="both"/>
+      </w:pPr>
+      <w:r>
+        <w:rPr>
+          <w:b w:val="0"/>
+          <w:i w:val="0"/>
+        </w:rPr>
+        <w:t>Cada NPC possui três clipes de áudio distintos: a narrativa principal (</w:t>
+      </w:r>
+      <w:r>
+        <w:rPr>
+          <w:rFonts w:ascii="Consolas" w:hAnsi="Consolas"/>
+          <w:b w:val="0"/>
+          <w:i w:val="0"/>
+          <w:sz w:val="20"/>
+        </w:rPr>
+        <w:t>storyClip</w:t>
+      </w:r>
+      <w:r>
+        <w:rPr>
+          <w:b w:val="0"/>
+          <w:i w:val="0"/>
+        </w:rPr>
+        <w:t>), um SFX curto de interrupção (por exemplo, "Alguma dúvida?", proferido pelo personagem) e um SFX de retomada (por exemplo, "Continuando..."). Esses SFX foram concebidos como reações naturais do narrador às ações do usuário, reforçando a impressão de interlocução genuína em vez de mera reprodução automática.</w:t>
+      </w:r>
+    </w:p>
+    <w:p>
+      <w:pPr>
+        <w:jc w:val="both"/>
+      </w:pPr>
+      <w:r>
+        <w:rPr>
+          <w:b w:val="0"/>
+          <w:i w:val="0"/>
+        </w:rPr>
+        <w:t xml:space="preserve">A implementação utiliza dois </w:t>
+      </w:r>
+      <w:r>
+        <w:rPr>
+          <w:rFonts w:ascii="Consolas" w:hAnsi="Consolas"/>
+          <w:b w:val="0"/>
+          <w:i w:val="0"/>
+          <w:sz w:val="20"/>
+        </w:rPr>
+        <w:t>AudioSources</w:t>
+      </w:r>
+      <w:r>
+        <w:rPr>
+          <w:b w:val="0"/>
+          <w:i w:val="0"/>
+        </w:rPr>
+        <w:t xml:space="preserve"> distintos, criados em tempo de execução: um dedicado à narrativa principal — para permitir </w:t>
+      </w:r>
+      <w:r>
+        <w:rPr>
+          <w:rFonts w:ascii="Consolas" w:hAnsi="Consolas"/>
+          <w:b w:val="0"/>
+          <w:i w:val="0"/>
+          <w:sz w:val="20"/>
+        </w:rPr>
+        <w:t>Pause()</w:t>
+      </w:r>
+      <w:r>
+        <w:rPr>
+          <w:b w:val="0"/>
+          <w:i w:val="0"/>
+        </w:rPr>
+        <w:t xml:space="preserve"> e </w:t>
+      </w:r>
+      <w:r>
+        <w:rPr>
+          <w:rFonts w:ascii="Consolas" w:hAnsi="Consolas"/>
+          <w:b w:val="0"/>
+          <w:i w:val="0"/>
+          <w:sz w:val="20"/>
+        </w:rPr>
+        <w:t>UnPause()</w:t>
+      </w:r>
+      <w:r>
+        <w:rPr>
+          <w:b w:val="0"/>
+          <w:i w:val="0"/>
+        </w:rPr>
+        <w:t xml:space="preserve"> sem perder a posição temporal — e outro para os SFX, evitando que a reprodução de um SFX interfira no tempo de reprodução da história. Essa separação é uma decisão arquitetural deliberada: a tentativa inicial de utilizar um único </w:t>
+      </w:r>
+      <w:r>
+        <w:rPr>
+          <w:rFonts w:ascii="Consolas" w:hAnsi="Consolas"/>
+          <w:b w:val="0"/>
+          <w:i w:val="0"/>
+          <w:sz w:val="20"/>
+        </w:rPr>
+        <w:t>AudioSource</w:t>
+      </w:r>
+      <w:r>
+        <w:rPr>
+          <w:b w:val="0"/>
+          <w:i w:val="0"/>
+        </w:rPr>
+        <w:t xml:space="preserve"> levou a comportamentos indesejados nos quais o SFX sobrescrevia o estado de reprodução da narrativa principal.</w:t>
+      </w:r>
+    </w:p>
+    <w:p>
+      <w:pPr>
+        <w:jc w:val="both"/>
+      </w:pPr>
+      <w:r>
+        <w:rPr>
+          <w:b w:val="0"/>
+          <w:i w:val="0"/>
+        </w:rPr>
+        <w:t>O áudio é configurado como espacial (</w:t>
+      </w:r>
+      <w:r>
+        <w:rPr>
+          <w:rFonts w:ascii="Consolas" w:hAnsi="Consolas"/>
+          <w:b w:val="0"/>
+          <w:i w:val="0"/>
+          <w:sz w:val="20"/>
+        </w:rPr>
+        <w:t>spatialBlend = 1</w:t>
+      </w:r>
+      <w:r>
+        <w:rPr>
+          <w:b w:val="0"/>
+          <w:i w:val="0"/>
+        </w:rPr>
+        <w:t>), de modo que a percepção sonora do usuário é coerente com a posição do NPC no espaço tridimensional — afastando-se do NPC, o som atenua de forma realística.</w:t>
+      </w:r>
+    </w:p>
+    <w:p>
+      <w:pPr>
+        <w:spacing w:before="240" w:after="120"/>
+      </w:pPr>
+      <w:r>
+        <w:rPr>
+          <w:b/>
+          <w:i w:val="0"/>
+          <w:color w:val="000000"/>
+          <w:sz w:val="24"/>
+        </w:rPr>
+        <w:t>4.4. Padrão Wrapper Prefab para Modelos GLB</w:t>
+      </w:r>
+    </w:p>
+    <w:p>
+      <w:pPr>
+        <w:jc w:val="both"/>
+      </w:pPr>
+      <w:r>
+        <w:rPr>
+          <w:b w:val="0"/>
+          <w:i w:val="0"/>
+        </w:rPr>
+        <w:t xml:space="preserve">A engine Unity impõe restrições sobre a edição direta de hierarquias importadas a partir de arquivos GLB: não é possível adicionar componentes diretamente ao GameObject raiz do modelo importado, pois esse raiz é considerado imutável pelo importador. Para contornar essa limitação sem comprometer a integração com o pipeline do Blender, adotou-se o padrão </w:t>
+      </w:r>
+      <w:r>
+        <w:rPr>
+          <w:b/>
+          <w:i w:val="0"/>
+        </w:rPr>
+        <w:t>wrapper prefab</w:t>
+      </w:r>
+      <w:r>
+        <w:rPr>
+          <w:b w:val="0"/>
+          <w:i w:val="0"/>
+        </w:rPr>
+        <w:t>.</w:t>
+      </w:r>
+    </w:p>
+    <w:p>
+      <w:pPr>
+        <w:jc w:val="both"/>
+      </w:pPr>
+      <w:r>
+        <w:rPr>
+          <w:b w:val="0"/>
+          <w:i w:val="0"/>
+        </w:rPr>
+        <w:t>Nesse padrão, um GameObject vazio na cena assume o papel de raiz funcional, carregando os componentes lógicos (</w:t>
+      </w:r>
+      <w:r>
+        <w:rPr>
+          <w:rFonts w:ascii="Consolas" w:hAnsi="Consolas"/>
+          <w:b w:val="0"/>
+          <w:i w:val="0"/>
+          <w:sz w:val="20"/>
+        </w:rPr>
+        <w:t>NpcStory</w:t>
+      </w:r>
+      <w:r>
+        <w:rPr>
+          <w:b w:val="0"/>
+          <w:i w:val="0"/>
+        </w:rPr>
+        <w:t xml:space="preserve">, </w:t>
+      </w:r>
+      <w:r>
+        <w:rPr>
+          <w:rFonts w:ascii="Consolas" w:hAnsi="Consolas"/>
+          <w:b w:val="0"/>
+          <w:i w:val="0"/>
+          <w:sz w:val="20"/>
+        </w:rPr>
+        <w:t>BoxCollider</w:t>
+      </w:r>
+      <w:r>
+        <w:rPr>
+          <w:b w:val="0"/>
+          <w:i w:val="0"/>
+        </w:rPr>
+        <w:t xml:space="preserve">, </w:t>
+      </w:r>
+      <w:r>
+        <w:rPr>
+          <w:rFonts w:ascii="Consolas" w:hAnsi="Consolas"/>
+          <w:b w:val="0"/>
+          <w:i w:val="0"/>
+          <w:sz w:val="20"/>
+        </w:rPr>
+        <w:t>AudioSource</w:t>
+      </w:r>
+      <w:r>
+        <w:rPr>
+          <w:b w:val="0"/>
+          <w:i w:val="0"/>
+        </w:rPr>
+        <w:t xml:space="preserve"> e a </w:t>
+      </w:r>
+      <w:r>
+        <w:rPr>
+          <w:b w:val="0"/>
           <w:i/>
-          <w:color w:val="808080"/>
-        </w:rPr>
-        <w:t>[  Figura 6: salve o screenshot como  figuras\fig6_lobby_topdown.png  e rode md_to_docx.py novamente  ]</w:t>
+        </w:rPr>
+        <w:t>layer</w:t>
+      </w:r>
+      <w:r>
+        <w:rPr>
+          <w:b w:val="0"/>
+          <w:i w:val="0"/>
+        </w:rPr>
+        <w:t xml:space="preserve"> </w:t>
+      </w:r>
+      <w:r>
+        <w:rPr>
+          <w:rFonts w:ascii="Consolas" w:hAnsi="Consolas"/>
+          <w:b w:val="0"/>
+          <w:i w:val="0"/>
+          <w:sz w:val="20"/>
+        </w:rPr>
+        <w:t>Interactable</w:t>
+      </w:r>
+      <w:r>
+        <w:rPr>
+          <w:b w:val="0"/>
+          <w:i w:val="0"/>
+        </w:rPr>
+        <w:t>), enquanto o GLB é incorporado como filho desse wrapper. Visualmente, a hierarquia é a seguinte:</w:t>
+      </w:r>
+    </w:p>
+    <w:p>
+      <w:r>
+        <w:rPr>
+          <w:rFonts w:ascii="Consolas" w:hAnsi="Consolas"/>
+          <w:sz w:val="20"/>
+        </w:rPr>
+        <w:t>NPC_Root (Layer: Interactable, BoxCollider, NpcStory, AudioSource)</w:t>
+        <w:br/>
+        <w:t>└── GLB_Model (Knight, Pharaoh, Geisha ou Curupira)</w:t>
+      </w:r>
+    </w:p>
+    <w:p>
+      <w:pPr>
+        <w:jc w:val="center"/>
+      </w:pPr>
+      <w:r>
+        <w:drawing>
+          <wp:inline xmlns:a="http://schemas.openxmlformats.org/drawingml/2006/main" xmlns:pic="http://schemas.openxmlformats.org/drawingml/2006/picture">
+            <wp:extent cx="5486400" cy="2579298"/>
+            <wp:docPr id="4" name="Picture 4"/>
+            <wp:cNvGraphicFramePr>
+              <a:graphicFrameLocks noChangeAspect="1"/>
+            </wp:cNvGraphicFramePr>
+            <a:graphic>
+              <a:graphicData uri="http://schemas.openxmlformats.org/drawingml/2006/picture">
+                <pic:pic>
+                  <pic:nvPicPr>
+                    <pic:cNvPr id="0" name="fig5_hierarchy.png"/>
+                    <pic:cNvPicPr/>
+                  </pic:nvPicPr>
+                  <pic:blipFill>
+                    <a:blip r:embed="rId12"/>
+                    <a:stretch>
+                      <a:fillRect/>
+                    </a:stretch>
+                  </pic:blipFill>
+                  <pic:spPr>
+                    <a:xfrm>
+                      <a:off x="0" y="0"/>
+                      <a:ext cx="5486400" cy="2579298"/>
+                    </a:xfrm>
+                    <a:prstGeom prst="rect"/>
+                  </pic:spPr>
+                </pic:pic>
+              </a:graphicData>
+            </a:graphic>
+          </wp:inline>
+        </w:drawing>
+      </w:r>
+    </w:p>
+    <w:p>
+      <w:pPr>
+        <w:spacing w:before="80" w:after="200"/>
+        <w:jc w:val="center"/>
+      </w:pPr>
+      <w:r>
+        <w:rPr>
+          <w:b/>
+          <w:sz w:val="20"/>
+        </w:rPr>
+        <w:t xml:space="preserve">Figura 5. </w:t>
+      </w:r>
+      <w:r>
+        <w:rPr>
+          <w:b w:val="0"/>
+          <w:i w:val="0"/>
+          <w:sz w:val="20"/>
+        </w:rPr>
+        <w:t>Screenshot da janela Hierarchy do Unity Editor, mostrando a estrutura wrapper prefab aplicada a um dos NPCs. Ao lado, o painel Inspector destacando os componentes anexados ao GameObject raiz.</w:t>
+      </w:r>
+    </w:p>
+    <w:p>
+      <w:pPr>
+        <w:jc w:val="both"/>
+      </w:pPr>
+      <w:r>
+        <w:rPr>
+          <w:b w:val="0"/>
+          <w:i w:val="0"/>
+        </w:rPr>
+        <w:t xml:space="preserve">Esse padrão isola a configuração lógica do conteúdo visual, permitindo que a substituição de um modelo — por exemplo, durante iteração artística ou migração para FBX — não exija reconfiguração dos componentes funcionais. A </w:t>
+      </w:r>
+      <w:r>
+        <w:rPr>
+          <w:b w:val="0"/>
+          <w:i/>
+        </w:rPr>
+        <w:t>layer</w:t>
+      </w:r>
+      <w:r>
+        <w:rPr>
+          <w:b w:val="0"/>
+          <w:i w:val="0"/>
+        </w:rPr>
+        <w:t xml:space="preserve"> </w:t>
+      </w:r>
+      <w:r>
+        <w:rPr>
+          <w:rFonts w:ascii="Consolas" w:hAnsi="Consolas"/>
+          <w:b w:val="0"/>
+          <w:i w:val="0"/>
+          <w:sz w:val="20"/>
+        </w:rPr>
+        <w:t>Interactable</w:t>
+      </w:r>
+      <w:r>
+        <w:rPr>
+          <w:b w:val="0"/>
+          <w:i w:val="0"/>
+        </w:rPr>
+        <w:t xml:space="preserve"> aplicada ao wrapper garante que o raycast do </w:t>
+      </w:r>
+      <w:r>
+        <w:rPr>
+          <w:rFonts w:ascii="Consolas" w:hAnsi="Consolas"/>
+          <w:b w:val="0"/>
+          <w:i w:val="0"/>
+          <w:sz w:val="20"/>
+        </w:rPr>
+        <w:t>PlayerRayInteractor</w:t>
+      </w:r>
+      <w:r>
+        <w:rPr>
+          <w:b w:val="0"/>
+          <w:i w:val="0"/>
+        </w:rPr>
+        <w:t xml:space="preserve"> detecte o NPC mesmo quando o usuário aponta diretamente para a malha do modelo, graças à propagação de hits para o componente raiz via </w:t>
+      </w:r>
+      <w:r>
+        <w:rPr>
+          <w:rFonts w:ascii="Consolas" w:hAnsi="Consolas"/>
+          <w:b w:val="0"/>
+          <w:i w:val="0"/>
+          <w:sz w:val="20"/>
+        </w:rPr>
+        <w:t>GetComponentInParent&lt;IInteractable&gt;()</w:t>
+      </w:r>
+      <w:r>
+        <w:rPr>
+          <w:b w:val="0"/>
+          <w:i w:val="0"/>
+        </w:rPr>
+        <w:t>.</w:t>
+      </w:r>
+    </w:p>
+    <w:p>
+      <w:pPr>
+        <w:spacing w:before="240" w:after="120"/>
+      </w:pPr>
+      <w:r>
+        <w:rPr>
+          <w:b/>
+          <w:i w:val="0"/>
+          <w:color w:val="000000"/>
+          <w:sz w:val="24"/>
+        </w:rPr>
+        <w:t>4.5. Navegação entre Cenas via Portais Interativos</w:t>
+      </w:r>
+    </w:p>
+    <w:p>
+      <w:pPr>
+        <w:jc w:val="both"/>
+      </w:pPr>
+      <w:r>
+        <w:rPr>
+          <w:b w:val="0"/>
+          <w:i w:val="0"/>
+        </w:rPr>
+        <w:t>A navegação entre as quatro cenas-continente e a cena central (</w:t>
+      </w:r>
+      <w:r>
+        <w:rPr>
+          <w:b w:val="0"/>
+          <w:i/>
+        </w:rPr>
+        <w:t>Lobby</w:t>
+      </w:r>
+      <w:r>
+        <w:rPr>
+          <w:b w:val="0"/>
+          <w:i w:val="0"/>
+        </w:rPr>
+        <w:t xml:space="preserve">) é mediada por portais físicos no ambiente. Cada portal é um GameObject contendo um </w:t>
+      </w:r>
+      <w:r>
+        <w:rPr>
+          <w:rFonts w:ascii="Consolas" w:hAnsi="Consolas"/>
+          <w:b w:val="0"/>
+          <w:i w:val="0"/>
+          <w:sz w:val="20"/>
+        </w:rPr>
+        <w:t>BoxCollider</w:t>
+      </w:r>
+      <w:r>
+        <w:rPr>
+          <w:b w:val="0"/>
+          <w:i w:val="0"/>
+        </w:rPr>
+        <w:t xml:space="preserve"> na camada </w:t>
+      </w:r>
+      <w:r>
+        <w:rPr>
+          <w:rFonts w:ascii="Consolas" w:hAnsi="Consolas"/>
+          <w:b w:val="0"/>
+          <w:i w:val="0"/>
+          <w:sz w:val="20"/>
+        </w:rPr>
+        <w:t>Interactable</w:t>
+      </w:r>
+      <w:r>
+        <w:rPr>
+          <w:b w:val="0"/>
+          <w:i w:val="0"/>
+        </w:rPr>
+        <w:t xml:space="preserve"> e o componente </w:t>
+      </w:r>
+      <w:r>
+        <w:rPr>
+          <w:rFonts w:ascii="Consolas" w:hAnsi="Consolas"/>
+          <w:b w:val="0"/>
+          <w:i w:val="0"/>
+          <w:sz w:val="20"/>
+        </w:rPr>
+        <w:t>ScenePortal</w:t>
+      </w:r>
+      <w:r>
+        <w:rPr>
+          <w:b w:val="0"/>
+          <w:i w:val="0"/>
+        </w:rPr>
+        <w:t xml:space="preserve">, que implementa </w:t>
+      </w:r>
+      <w:r>
+        <w:rPr>
+          <w:rFonts w:ascii="Consolas" w:hAnsi="Consolas"/>
+          <w:b w:val="0"/>
+          <w:i w:val="0"/>
+          <w:sz w:val="20"/>
+        </w:rPr>
+        <w:t>IInteractable</w:t>
+      </w:r>
+      <w:r>
+        <w:rPr>
+          <w:b w:val="0"/>
+          <w:i w:val="0"/>
+        </w:rPr>
+        <w:t xml:space="preserve">. Ao ser ativado pelo jogador, o portal registra em uma variável estática a cena de origem e invoca </w:t>
+      </w:r>
+      <w:r>
+        <w:rPr>
+          <w:rFonts w:ascii="Consolas" w:hAnsi="Consolas"/>
+          <w:b w:val="0"/>
+          <w:i w:val="0"/>
+          <w:sz w:val="20"/>
+        </w:rPr>
+        <w:t>SceneManager.LoadScene</w:t>
+      </w:r>
+      <w:r>
+        <w:rPr>
+          <w:b w:val="0"/>
+          <w:i w:val="0"/>
+        </w:rPr>
+        <w:t xml:space="preserve"> com o nome da cena de destino.</w:t>
+      </w:r>
+    </w:p>
+    <w:p>
+      <w:pPr>
+        <w:jc w:val="both"/>
+      </w:pPr>
+      <w:r>
+        <w:rPr>
+          <w:b w:val="0"/>
+          <w:i w:val="0"/>
+        </w:rPr>
+        <w:t xml:space="preserve">A cena central, </w:t>
+      </w:r>
+      <w:r>
+        <w:rPr>
+          <w:b w:val="0"/>
+          <w:i/>
+        </w:rPr>
+        <w:t>Scene_Lobby</w:t>
+      </w:r>
+      <w:r>
+        <w:rPr>
+          <w:b w:val="0"/>
+          <w:i w:val="0"/>
+        </w:rPr>
+        <w:t>, contém quatro portais — um para cada continente — dispostos em torno do ponto de spawn inicial do jogador. Cada portal é identificado por uma etiqueta tridimensional (</w:t>
+      </w:r>
+      <w:r>
+        <w:rPr>
+          <w:b w:val="0"/>
+          <w:i/>
+        </w:rPr>
+        <w:t>TextMesh</w:t>
+      </w:r>
+      <w:r>
+        <w:rPr>
+          <w:b w:val="0"/>
+          <w:i w:val="0"/>
+        </w:rPr>
+        <w:t xml:space="preserve">) posicionada acima dele, com comportamento de </w:t>
+      </w:r>
+      <w:r>
+        <w:rPr>
+          <w:b w:val="0"/>
+          <w:i/>
+        </w:rPr>
+        <w:t>billboard</w:t>
+      </w:r>
+      <w:r>
+        <w:rPr>
+          <w:b w:val="0"/>
+          <w:i w:val="0"/>
+        </w:rPr>
+        <w:t>: a etiqueta gira em torno do eixo vertical para sempre apresentar sua face frontal à câmera do jogador, garantindo legibilidade independentemente do ângulo de aproximação.</w:t>
+      </w:r>
+    </w:p>
+    <w:p>
+      <w:pPr>
+        <w:jc w:val="center"/>
+      </w:pPr>
+      <w:r>
+        <w:drawing>
+          <wp:inline xmlns:a="http://schemas.openxmlformats.org/drawingml/2006/main" xmlns:pic="http://schemas.openxmlformats.org/drawingml/2006/picture">
+            <wp:extent cx="5486400" cy="3005593"/>
+            <wp:docPr id="5" name="Picture 5"/>
+            <wp:cNvGraphicFramePr>
+              <a:graphicFrameLocks noChangeAspect="1"/>
+            </wp:cNvGraphicFramePr>
+            <a:graphic>
+              <a:graphicData uri="http://schemas.openxmlformats.org/drawingml/2006/picture">
+                <pic:pic>
+                  <pic:nvPicPr>
+                    <pic:cNvPr id="0" name="fig6_lobby_topdown.png"/>
+                    <pic:cNvPicPr/>
+                  </pic:nvPicPr>
+                  <pic:blipFill>
+                    <a:blip r:embed="rId13"/>
+                    <a:stretch>
+                      <a:fillRect/>
+                    </a:stretch>
+                  </pic:blipFill>
+                  <pic:spPr>
+                    <a:xfrm>
+                      <a:off x="0" y="0"/>
+                      <a:ext cx="5486400" cy="3005593"/>
+                    </a:xfrm>
+                    <a:prstGeom prst="rect"/>
+                  </pic:spPr>
+                </pic:pic>
+              </a:graphicData>
+            </a:graphic>
+          </wp:inline>
+        </w:drawing>
       </w:r>
     </w:p>
     <w:p>
@@ -3067,15 +3145,41 @@
     <w:p/>
     <w:p>
       <w:pPr>
-        <w:spacing w:before="160"/>
         <w:jc w:val="center"/>
       </w:pPr>
       <w:r>
-        <w:rPr>
-          <w:i/>
-          <w:color w:val="808080"/>
-        </w:rPr>
-        <w:t>[  Figura 7: salve o screenshot como  figuras\fig7_npcs.png  e rode md_to_docx.py novamente  ]</w:t>
+        <w:drawing>
+          <wp:inline xmlns:a="http://schemas.openxmlformats.org/drawingml/2006/main" xmlns:pic="http://schemas.openxmlformats.org/drawingml/2006/picture">
+            <wp:extent cx="5486400" cy="4468043"/>
+            <wp:docPr id="6" name="Picture 6"/>
+            <wp:cNvGraphicFramePr>
+              <a:graphicFrameLocks noChangeAspect="1"/>
+            </wp:cNvGraphicFramePr>
+            <a:graphic>
+              <a:graphicData uri="http://schemas.openxmlformats.org/drawingml/2006/picture">
+                <pic:pic>
+                  <pic:nvPicPr>
+                    <pic:cNvPr id="0" name="fig7_npcs.png"/>
+                    <pic:cNvPicPr/>
+                  </pic:nvPicPr>
+                  <pic:blipFill>
+                    <a:blip r:embed="rId14"/>
+                    <a:stretch>
+                      <a:fillRect/>
+                    </a:stretch>
+                  </pic:blipFill>
+                  <pic:spPr>
+                    <a:xfrm>
+                      <a:off x="0" y="0"/>
+                      <a:ext cx="5486400" cy="4468043"/>
+                    </a:xfrm>
+                    <a:prstGeom prst="rect"/>
+                  </pic:spPr>
+                </pic:pic>
+              </a:graphicData>
+            </a:graphic>
+          </wp:inline>
+        </w:drawing>
       </w:r>
     </w:p>
     <w:p>

</xml_diff>

<commit_message>
Artigo: fig3 (crosshair) recapturada -> 7/7 figuras embedadas
Fig 3 agora mostra o crosshair branco (mirando o ambiente) lado-a-lado com o
vermelho (mirando o Knight), exatamente como o caption descreve. Captura
correta apos o fix do PNG (branco com contorno) + auto-find do crosshair no
PlayerRayInteractor.

Regenerado .docx e .pdf com todas as 7 figuras embutidas (2 diagramas + 5
screenshots) + Tabela 1.

Co-Authored-By: Claude Opus 4.7 (1M context) <noreply@anthropic.com>
</commit_message>
<xml_diff>
--- a/Project_essay/Artigo_SBC_VR_Folklore.docx
+++ b/Project_essay/Artigo_SBC_VR_Folklore.docx
@@ -1462,15 +1462,41 @@
     </w:p>
     <w:p>
       <w:pPr>
-        <w:spacing w:before="160"/>
         <w:jc w:val="center"/>
       </w:pPr>
       <w:r>
-        <w:rPr>
-          <w:i/>
-          <w:color w:val="808080"/>
-        </w:rPr>
-        <w:t>[  Figura 3: salve o screenshot como  figuras\fig3_crosshair.png  e rode md_to_docx.py novamente  ]</w:t>
+        <w:drawing>
+          <wp:inline xmlns:a="http://schemas.openxmlformats.org/drawingml/2006/main" xmlns:pic="http://schemas.openxmlformats.org/drawingml/2006/picture">
+            <wp:extent cx="5486400" cy="2871434"/>
+            <wp:docPr id="3" name="Picture 3"/>
+            <wp:cNvGraphicFramePr>
+              <a:graphicFrameLocks noChangeAspect="1"/>
+            </wp:cNvGraphicFramePr>
+            <a:graphic>
+              <a:graphicData uri="http://schemas.openxmlformats.org/drawingml/2006/picture">
+                <pic:pic>
+                  <pic:nvPicPr>
+                    <pic:cNvPr id="0" name="fig3_crosshair.png"/>
+                    <pic:cNvPicPr/>
+                  </pic:nvPicPr>
+                  <pic:blipFill>
+                    <a:blip r:embed="rId11"/>
+                    <a:stretch>
+                      <a:fillRect/>
+                    </a:stretch>
+                  </pic:blipFill>
+                  <pic:spPr>
+                    <a:xfrm>
+                      <a:off x="0" y="0"/>
+                      <a:ext cx="5486400" cy="2871434"/>
+                    </a:xfrm>
+                    <a:prstGeom prst="rect"/>
+                  </pic:spPr>
+                </pic:pic>
+              </a:graphicData>
+            </a:graphic>
+          </wp:inline>
+        </w:drawing>
       </w:r>
     </w:p>
     <w:p>
@@ -1755,7 +1781,7 @@
         <w:drawing>
           <wp:inline xmlns:a="http://schemas.openxmlformats.org/drawingml/2006/main" xmlns:pic="http://schemas.openxmlformats.org/drawingml/2006/picture">
             <wp:extent cx="5486400" cy="3584448"/>
-            <wp:docPr id="3" name="Picture 3"/>
+            <wp:docPr id="4" name="Picture 4"/>
             <wp:cNvGraphicFramePr>
               <a:graphicFrameLocks noChangeAspect="1"/>
             </wp:cNvGraphicFramePr>
@@ -1767,7 +1793,7 @@
                     <pic:cNvPicPr/>
                   </pic:nvPicPr>
                   <pic:blipFill>
-                    <a:blip r:embed="rId11"/>
+                    <a:blip r:embed="rId12"/>
                     <a:stretch>
                       <a:fillRect/>
                     </a:stretch>
@@ -2224,7 +2250,7 @@
         <w:drawing>
           <wp:inline xmlns:a="http://schemas.openxmlformats.org/drawingml/2006/main" xmlns:pic="http://schemas.openxmlformats.org/drawingml/2006/picture">
             <wp:extent cx="5486400" cy="2579298"/>
-            <wp:docPr id="4" name="Picture 4"/>
+            <wp:docPr id="5" name="Picture 5"/>
             <wp:cNvGraphicFramePr>
               <a:graphicFrameLocks noChangeAspect="1"/>
             </wp:cNvGraphicFramePr>
@@ -2236,7 +2262,7 @@
                     <pic:cNvPicPr/>
                   </pic:nvPicPr>
                   <pic:blipFill>
-                    <a:blip r:embed="rId12"/>
+                    <a:blip r:embed="rId13"/>
                     <a:stretch>
                       <a:fillRect/>
                     </a:stretch>
@@ -2532,7 +2558,7 @@
         <w:drawing>
           <wp:inline xmlns:a="http://schemas.openxmlformats.org/drawingml/2006/main" xmlns:pic="http://schemas.openxmlformats.org/drawingml/2006/picture">
             <wp:extent cx="5486400" cy="3005593"/>
-            <wp:docPr id="5" name="Picture 5"/>
+            <wp:docPr id="6" name="Picture 6"/>
             <wp:cNvGraphicFramePr>
               <a:graphicFrameLocks noChangeAspect="1"/>
             </wp:cNvGraphicFramePr>
@@ -2544,7 +2570,7 @@
                     <pic:cNvPicPr/>
                   </pic:nvPicPr>
                   <pic:blipFill>
-                    <a:blip r:embed="rId13"/>
+                    <a:blip r:embed="rId14"/>
                     <a:stretch>
                       <a:fillRect/>
                     </a:stretch>
@@ -3151,7 +3177,7 @@
         <w:drawing>
           <wp:inline xmlns:a="http://schemas.openxmlformats.org/drawingml/2006/main" xmlns:pic="http://schemas.openxmlformats.org/drawingml/2006/picture">
             <wp:extent cx="5486400" cy="4468043"/>
-            <wp:docPr id="6" name="Picture 6"/>
+            <wp:docPr id="7" name="Picture 7"/>
             <wp:cNvGraphicFramePr>
               <a:graphicFrameLocks noChangeAspect="1"/>
             </wp:cNvGraphicFramePr>
@@ -3163,7 +3189,7 @@
                     <pic:cNvPicPr/>
                   </pic:nvPicPr>
                   <pic:blipFill>
-                    <a:blip r:embed="rId14"/>
+                    <a:blip r:embed="rId15"/>
                     <a:stretch>
                       <a:fillRect/>
                     </a:stretch>

</xml_diff>

<commit_message>
Artigo: adiciona secao "Disponibilidade" com link do repo e do video
Adicionado ao final da secao 6 (Consideracoes Finais), antes das Referencias,
um paragrafo "Disponibilidade" contendo o link do repositorio publico no GitHub
e o link da demonstracao em video no YouTube (nao listado).

Como o repo eh publico, o link do video unlisted NAO entra no README -
fica apenas no artigo, que vai diretamente ao professor.

Co-Authored-By: Claude Opus 4.7 (1M context) <noreply@anthropic.com>
</commit_message>
<xml_diff>
--- a/Project_essay/Artigo_SBC_VR_Folklore.docx
+++ b/Project_essay/Artigo_SBC_VR_Folklore.docx
@@ -3498,6 +3498,25 @@
           <w:i w:val="0"/>
         </w:rPr>
         <w:t xml:space="preserve"> funcional e auditável a partir do qual essas evoluções podem ser conduzidas de forma incremental.</w:t>
+      </w:r>
+    </w:p>
+    <w:p>
+      <w:pPr>
+        <w:jc w:val="both"/>
+      </w:pPr>
+      <w:r>
+        <w:rPr>
+          <w:b/>
+          <w:i w:val="0"/>
+        </w:rPr>
+        <w:t>Disponibilidade.</w:t>
+      </w:r>
+      <w:r>
+        <w:rPr>
+          <w:b w:val="0"/>
+          <w:i w:val="0"/>
+        </w:rPr>
+        <w:t xml:space="preserve"> O código-fonte do projeto está disponível em repositório público no GitHub, em https://github.com/leohellyeah/RV_Project_Unisagrado. Uma demonstração em vídeo do protótipo em execução, mostrando a navegação entre cenas e o ciclo de iniciar, interromper e retomar a narrativa, pode ser acessada em https://youtu.be/X3BIjKRZZkE.</w:t>
       </w:r>
     </w:p>
     <w:p>

</xml_diff>